<commit_message>
Update handout directory/script names
</commit_message>
<xml_diff>
--- a/Session1_UVVis_Benchmarking_Handout.docx
+++ b/Session1_UVVis_Benchmarking_Handout.docx
@@ -134,7 +134,7 @@
           <w:sz w:val="20"/>
           <w:szCs w:val="20"/>
         </w:rPr>
-        <w:t xml:space="preserve">Because PNA is structurally rigid, conformational averaging is unnecessary, and you can focus entirely on the electronic structure dimension: how the choice of density functional, basis set, and solvent model influences the position and intensity of the absorption maximum. You will run the complete eight-script workflow, compare your computed spectrum to published experimental data, and justify your final protocol choices by reference to the benchmarking literature.</w:t>
+        <w:t xml:space="preserve">Because PNA is structurally rigid, conformational averaging is unnecessary, and you can focus entirely on the electronic structure dimension: how the choice of density functional, basis set, and solvent model influences the position and intensity of the absorption maximum. You will run the complete six-stage workflow, compare your computed spectrum to published experimental data, and justify your final protocol choices by reference to the benchmarking literature.</w:t>
       </w:r>
     </w:p>
     <w:p>
@@ -412,7 +412,7 @@
           <w:sz w:val="20"/>
           <w:szCs w:val="20"/>
         </w:rPr>
-        <w:t xml:space="preserve">Copy the workflow scripts (Scripts 1–8) into this directory, or ensure they are in your PATH. Verify that the scripts are executable:</w:t>
+        <w:t xml:space="preserve">Copy the workflow scripts (Scripts 1-8) into this directory, or ensure they are in your PATH. Verify that the scripts are executable:</w:t>
       </w:r>
     </w:p>
     <w:tbl>
@@ -458,33 +458,33 @@
                 <w:sz w:val="17"/>
                 <w:szCs w:val="17"/>
               </w:rPr>
-              <w:t xml:space="preserve">chmod +x 1_orca_gasopt.sh 2_confab.sh 3_orca_solventopt.sh \</w:t>
-            </w:r>
-          </w:p>
-          <w:p>
-            <w:pPr>
-              <w:spacing w:after="20"/>
-            </w:pPr>
-            <w:r>
-              <w:rPr>
-                <w:rFonts w:ascii="Courier New" w:cs="Courier New" w:eastAsia="Courier New" w:hAnsi="Courier New"/>
-                <w:sz w:val="17"/>
-                <w:szCs w:val="17"/>
-              </w:rPr>
-              <w:t xml:space="preserve">         4_boltzmann_filter.sh 5_orca_tddft.sh \</w:t>
-            </w:r>
-          </w:p>
-          <w:p>
-            <w:pPr>
-              <w:spacing w:after="20"/>
-            </w:pPr>
-            <w:r>
-              <w:rPr>
-                <w:rFonts w:ascii="Courier New" w:cs="Courier New" w:eastAsia="Courier New" w:hAnsi="Courier New"/>
-                <w:sz w:val="17"/>
-                <w:szCs w:val="17"/>
-              </w:rPr>
-              <w:t xml:space="preserve">         6_data_extract_ecd.sh 7_spectra_prep_ecd.sh</w:t>
+              <w:t xml:space="preserve">chmod +x 1-orca-init-opt.sh 2-orca-conf-search.sh 4-orca-solvent-opt.sh \</w:t>
+            </w:r>
+          </w:p>
+          <w:p>
+            <w:pPr>
+              <w:spacing w:after="20"/>
+            </w:pPr>
+            <w:r>
+              <w:rPr>
+                <w:rFonts w:ascii="Courier New" w:cs="Courier New" w:eastAsia="Courier New" w:hAnsi="Courier New"/>
+                <w:sz w:val="17"/>
+                <w:szCs w:val="17"/>
+              </w:rPr>
+              <w:t xml:space="preserve">         5-orca-boltzmann-weight.sh 6-orca-ecd.sh \</w:t>
+            </w:r>
+          </w:p>
+          <w:p>
+            <w:pPr>
+              <w:spacing w:after="20"/>
+            </w:pPr>
+            <w:r>
+              <w:rPr>
+                <w:rFonts w:ascii="Courier New" w:cs="Courier New" w:eastAsia="Courier New" w:hAnsi="Courier New"/>
+                <w:sz w:val="17"/>
+                <w:szCs w:val="17"/>
+              </w:rPr>
+              <w:t xml:space="preserve">         or_ecd_uvvis_tools.py or_ecd_uvvis_tools.py</w:t>
             </w:r>
           </w:p>
         </w:tc>
@@ -689,7 +689,7 @@
                 <w:sz w:val="17"/>
                 <w:szCs w:val="17"/>
               </w:rPr>
-              <w:t xml:space="preserve">...  (remaining atoms)</w:t>
+              <w:t xml:space="preserve">... (remaining atoms)</w:t>
             </w:r>
           </w:p>
         </w:tc>
@@ -792,7 +792,7 @@
                 <w:sz w:val="19"/>
                 <w:szCs w:val="19"/>
               </w:rPr>
-              <w:t xml:space="preserve">This convention is used by Scripts 1, 3, and 5.</w:t>
+              <w:t xml:space="preserve">This convention is used by Stages 1, 4, and 6.</w:t>
             </w:r>
           </w:p>
         </w:tc>
@@ -915,7 +915,7 @@
           <w:sz w:val="28"/>
           <w:szCs w:val="28"/>
         </w:rPr>
-        <w:t xml:space="preserve">Part 2: Baseline Run — The Complete Pipeline</w:t>
+        <w:t xml:space="preserve">Part 2: Baseline Run - The Complete Pipeline</w:t>
       </w:r>
     </w:p>
     <w:p>
@@ -1003,7 +1003,7 @@
                 <w:sz w:val="17"/>
                 <w:szCs w:val="17"/>
               </w:rPr>
-              <w:t xml:space="preserve">./1_orca_gasopt.sh \</w:t>
+              <w:t xml:space="preserve">./1-orca-init-opt.sh \</w:t>
             </w:r>
           </w:p>
           <w:p>
@@ -1055,7 +1055,7 @@
                 <w:sz w:val="17"/>
                 <w:szCs w:val="17"/>
               </w:rPr>
-              <w:t xml:space="preserve">    --nprocs 4 \</w:t>
+              <w:t xml:space="preserve">    --cpus 4 \</w:t>
             </w:r>
           </w:p>
           <w:p>
@@ -1084,7 +1084,7 @@
           <w:sz w:val="20"/>
           <w:szCs w:val="20"/>
         </w:rPr>
-        <w:t xml:space="preserve">This runs a B3LYP/def2-SVP optimization with Grimme's D3BJ dispersion correction. The optimized geometry will be written to pna/init_opt/pna_opt.xyz, along with the full ORCA output in pna/init_opt/pna_opt.out.</w:t>
+        <w:t xml:space="preserve">This runs a B3LYP/def2-SVP optimization with Grimme's D3BJ dispersion correction. The optimized geometry will be written to pna/01_gas_opt/pna.xyz, along with the full ORCA output in pna/01_gas_opt/pna.log.</w:t>
       </w:r>
     </w:p>
     <w:tbl>
@@ -1145,7 +1145,7 @@
                 <w:sz w:val="19"/>
                 <w:szCs w:val="19"/>
               </w:rPr>
-              <w:t xml:space="preserve">Open pna/init_opt/pna_opt.out in a text editor and search for "HURRAY" or</w:t>
+              <w:t xml:space="preserve">Open pna/01_gas_opt/pna.log in a text editor and search for "HURRAY" or</w:t>
             </w:r>
           </w:p>
           <w:p>
@@ -1184,7 +1184,7 @@
                 <w:sz w:val="19"/>
                 <w:szCs w:val="19"/>
               </w:rPr>
-              <w:t xml:space="preserve">If the optimization did not converge, you may need to increase --cycles.</w:t>
+              <w:t xml:space="preserve">If the optimization did not converge, you may need to increase --max-iter.</w:t>
             </w:r>
           </w:p>
         </w:tc>
@@ -1326,33 +1326,33 @@
                 <w:sz w:val="17"/>
                 <w:szCs w:val="17"/>
               </w:rPr>
-              <w:t xml:space="preserve">./2_confab.sh \</w:t>
-            </w:r>
-          </w:p>
-          <w:p>
-            <w:pPr>
-              <w:spacing w:after="20"/>
-            </w:pPr>
-            <w:r>
-              <w:rPr>
-                <w:rFonts w:ascii="Courier New" w:cs="Courier New" w:eastAsia="Courier New" w:hAnsi="Courier New"/>
-                <w:sz w:val="17"/>
-                <w:szCs w:val="17"/>
-              </w:rPr>
-              <w:t xml:space="preserve">    --ecutoff 5 \</w:t>
-            </w:r>
-          </w:p>
-          <w:p>
-            <w:pPr>
-              <w:spacing w:after="20"/>
-            </w:pPr>
-            <w:r>
-              <w:rPr>
-                <w:rFonts w:ascii="Courier New" w:cs="Courier New" w:eastAsia="Courier New" w:hAnsi="Courier New"/>
-                <w:sz w:val="17"/>
-                <w:szCs w:val="17"/>
-              </w:rPr>
-              <w:t xml:space="preserve">    --max-confs 500 \</w:t>
+              <w:t xml:space="preserve">./2-orca-conf-search.sh \</w:t>
+            </w:r>
+          </w:p>
+          <w:p>
+            <w:pPr>
+              <w:spacing w:after="20"/>
+            </w:pPr>
+            <w:r>
+              <w:rPr>
+                <w:rFonts w:ascii="Courier New" w:cs="Courier New" w:eastAsia="Courier New" w:hAnsi="Courier New"/>
+                <w:sz w:val="17"/>
+                <w:szCs w:val="17"/>
+              </w:rPr>
+              <w:t xml:space="preserve">    --ecut 5 \</w:t>
+            </w:r>
+          </w:p>
+          <w:p>
+            <w:pPr>
+              <w:spacing w:after="20"/>
+            </w:pPr>
+            <w:r>
+              <w:rPr>
+                <w:rFonts w:ascii="Courier New" w:cs="Courier New" w:eastAsia="Courier New" w:hAnsi="Courier New"/>
+                <w:sz w:val="17"/>
+                <w:szCs w:val="17"/>
+              </w:rPr>
+              <w:t xml:space="preserve">    --conf 500 \</w:t>
             </w:r>
           </w:p>
           <w:p>
@@ -1381,7 +1381,7 @@
           <w:sz w:val="20"/>
           <w:szCs w:val="20"/>
         </w:rPr>
-        <w:t xml:space="preserve">Confab works by systematically rotating each torsion angle and evaluating the resulting structures with a force field. The --ecutoff flag sets the energy window (in kcal/mol) above the lowest-energy conformer; any structure more than 5 kcal/mol higher is discarded. The --max-confs flag caps the total number of conformers returned.</w:t>
+        <w:t xml:space="preserve">Confab works by systematically rotating each torsion angle and evaluating the resulting structures with a force field. The --ecut flag sets the energy window (in kcal/mol) above the lowest-energy conformer; any structure more than 5 kcal/mol higher is discarded. The --conf flag caps the total number of conformers returned.</w:t>
       </w:r>
     </w:p>
     <w:p>
@@ -1440,7 +1440,7 @@
                 <w:sz w:val="17"/>
                 <w:szCs w:val="17"/>
               </w:rPr>
-              <w:t xml:space="preserve">ls pna/conf_init_opt/split_xyz/ | wc -l</w:t>
+              <w:t xml:space="preserve">ls pna/02_conf_search/split_xyz/ | wc -l</w:t>
             </w:r>
           </w:p>
         </w:tc>
@@ -1582,7 +1582,7 @@
                 <w:sz w:val="17"/>
                 <w:szCs w:val="17"/>
               </w:rPr>
-              <w:t xml:space="preserve">./3_orca_solventopt.sh \</w:t>
+              <w:t xml:space="preserve">./4-orca-solvent-opt.sh \</w:t>
             </w:r>
           </w:p>
           <w:p>
@@ -1634,33 +1634,33 @@
                 <w:sz w:val="17"/>
                 <w:szCs w:val="17"/>
               </w:rPr>
-              <w:t xml:space="preserve">    --solv-model CPCM \</w:t>
-            </w:r>
-          </w:p>
-          <w:p>
-            <w:pPr>
-              <w:spacing w:after="20"/>
-            </w:pPr>
-            <w:r>
-              <w:rPr>
-                <w:rFonts w:ascii="Courier New" w:cs="Courier New" w:eastAsia="Courier New" w:hAnsi="Courier New"/>
-                <w:sz w:val="17"/>
-                <w:szCs w:val="17"/>
-              </w:rPr>
-              <w:t xml:space="preserve">    --solvent WATER \</w:t>
-            </w:r>
-          </w:p>
-          <w:p>
-            <w:pPr>
-              <w:spacing w:after="20"/>
-            </w:pPr>
-            <w:r>
-              <w:rPr>
-                <w:rFonts w:ascii="Courier New" w:cs="Courier New" w:eastAsia="Courier New" w:hAnsi="Courier New"/>
-                <w:sz w:val="17"/>
-                <w:szCs w:val="17"/>
-              </w:rPr>
-              <w:t xml:space="preserve">    --nprocs 4 \</w:t>
+              <w:t xml:space="preserve">    \</w:t>
+            </w:r>
+          </w:p>
+          <w:p>
+            <w:pPr>
+              <w:spacing w:after="20"/>
+            </w:pPr>
+            <w:r>
+              <w:rPr>
+                <w:rFonts w:ascii="Courier New" w:cs="Courier New" w:eastAsia="Courier New" w:hAnsi="Courier New"/>
+                <w:sz w:val="17"/>
+                <w:szCs w:val="17"/>
+              </w:rPr>
+              <w:t xml:space="preserve">    --solvent water \</w:t>
+            </w:r>
+          </w:p>
+          <w:p>
+            <w:pPr>
+              <w:spacing w:after="20"/>
+            </w:pPr>
+            <w:r>
+              <w:rPr>
+                <w:rFonts w:ascii="Courier New" w:cs="Courier New" w:eastAsia="Courier New" w:hAnsi="Courier New"/>
+                <w:sz w:val="17"/>
+                <w:szCs w:val="17"/>
+              </w:rPr>
+              <w:t xml:space="preserve">    --cpus 4 \</w:t>
             </w:r>
           </w:p>
           <w:p>
@@ -1689,7 +1689,7 @@
           <w:sz w:val="20"/>
           <w:szCs w:val="20"/>
         </w:rPr>
-        <w:t xml:space="preserve">The CPCM (Conductor-like Polarizable Continuum Model) surrounds the molecule with a dielectric continuum that mimics the electrostatic environment of bulk water. The optimized structures are written to pna/solv_init_opt/pna_conf1/.</w:t>
+        <w:t xml:space="preserve">The CPCM (Conductor-like Polarizable Continuum Model) surrounds the molecule with a dielectric continuum that mimics the electrostatic environment of bulk water. The optimized structures are written to pna/03_solvent_opt/pna_conf1/.</w:t>
       </w:r>
     </w:p>
     <w:tbl>
@@ -1802,7 +1802,7 @@
                 <w:sz w:val="19"/>
                 <w:szCs w:val="19"/>
               </w:rPr>
-              <w:t xml:space="preserve">You can switch between them using the --solv-model flag.</w:t>
+              <w:t xml:space="preserve">You can switch between them using the flag.</w:t>
             </w:r>
           </w:p>
         </w:tc>
@@ -1880,7 +1880,7 @@
                 <w:sz w:val="17"/>
                 <w:szCs w:val="17"/>
               </w:rPr>
-              <w:t xml:space="preserve">./4_boltzmann_filter.sh \</w:t>
+              <w:t xml:space="preserve">./5-orca-boltzmann-weight.sh \</w:t>
             </w:r>
           </w:p>
           <w:p>
@@ -1906,7 +1906,7 @@
                 <w:sz w:val="17"/>
                 <w:szCs w:val="17"/>
               </w:rPr>
-              <w:t xml:space="preserve">    --thresh 0.01 \</w:t>
+              <w:t xml:space="preserve">    --p-cut 0.01 \</w:t>
             </w:r>
           </w:p>
           <w:p>
@@ -1935,7 +1935,7 @@
           <w:sz w:val="20"/>
           <w:szCs w:val="20"/>
         </w:rPr>
-        <w:t xml:space="preserve">The results are written to pna/bw_results/pna_filtered.dat. Examine this file:</w:t>
+        <w:t xml:space="preserve">The results are written to pna/04_boltzmann/pna_bw_labels.dat. Examine this file:</w:t>
       </w:r>
     </w:p>
     <w:tbl>
@@ -1981,7 +1981,7 @@
                 <w:sz w:val="17"/>
                 <w:szCs w:val="17"/>
               </w:rPr>
-              <w:t xml:space="preserve">cat pna/bw_results/pna_filtered.dat</w:t>
+              <w:t xml:space="preserve">cat pna/04_boltzmann/pna_bw_labels.dat</w:t>
             </w:r>
           </w:p>
         </w:tc>
@@ -2072,20 +2072,20 @@
                 <w:sz w:val="17"/>
                 <w:szCs w:val="17"/>
               </w:rPr>
-              <w:t xml:space="preserve">./5_orca_tddft.sh \</w:t>
-            </w:r>
-          </w:p>
-          <w:p>
-            <w:pPr>
-              <w:spacing w:after="20"/>
-            </w:pPr>
-            <w:r>
-              <w:rPr>
-                <w:rFonts w:ascii="Courier New" w:cs="Courier New" w:eastAsia="Courier New" w:hAnsi="Courier New"/>
-                <w:sz w:val="17"/>
-                <w:szCs w:val="17"/>
-              </w:rPr>
-              <w:t xml:space="preserve">    --func wB97X-D3 \</w:t>
+              <w:t xml:space="preserve">./6-orca-ecd.sh \</w:t>
+            </w:r>
+          </w:p>
+          <w:p>
+            <w:pPr>
+              <w:spacing w:after="20"/>
+            </w:pPr>
+            <w:r>
+              <w:rPr>
+                <w:rFonts w:ascii="Courier New" w:cs="Courier New" w:eastAsia="Courier New" w:hAnsi="Courier New"/>
+                <w:sz w:val="17"/>
+                <w:szCs w:val="17"/>
+              </w:rPr>
+              <w:t xml:space="preserve">    --method wB97X-D3 \</w:t>
             </w:r>
           </w:p>
           <w:p>
@@ -2111,46 +2111,46 @@
                 <w:sz w:val="17"/>
                 <w:szCs w:val="17"/>
               </w:rPr>
-              <w:t xml:space="preserve">    --solv-model CPCM \</w:t>
-            </w:r>
-          </w:p>
-          <w:p>
-            <w:pPr>
-              <w:spacing w:after="20"/>
-            </w:pPr>
-            <w:r>
-              <w:rPr>
-                <w:rFonts w:ascii="Courier New" w:cs="Courier New" w:eastAsia="Courier New" w:hAnsi="Courier New"/>
-                <w:sz w:val="17"/>
-                <w:szCs w:val="17"/>
-              </w:rPr>
-              <w:t xml:space="preserve">    --solvent WATER \</w:t>
-            </w:r>
-          </w:p>
-          <w:p>
-            <w:pPr>
-              <w:spacing w:after="20"/>
-            </w:pPr>
-            <w:r>
-              <w:rPr>
-                <w:rFonts w:ascii="Courier New" w:cs="Courier New" w:eastAsia="Courier New" w:hAnsi="Courier New"/>
-                <w:sz w:val="17"/>
-                <w:szCs w:val="17"/>
-              </w:rPr>
-              <w:t xml:space="preserve">    --nroots 20 \</w:t>
-            </w:r>
-          </w:p>
-          <w:p>
-            <w:pPr>
-              <w:spacing w:after="20"/>
-            </w:pPr>
-            <w:r>
-              <w:rPr>
-                <w:rFonts w:ascii="Courier New" w:cs="Courier New" w:eastAsia="Courier New" w:hAnsi="Courier New"/>
-                <w:sz w:val="17"/>
-                <w:szCs w:val="17"/>
-              </w:rPr>
-              <w:t xml:space="preserve">    --nprocs 4 \</w:t>
+              <w:t xml:space="preserve">    \</w:t>
+            </w:r>
+          </w:p>
+          <w:p>
+            <w:pPr>
+              <w:spacing w:after="20"/>
+            </w:pPr>
+            <w:r>
+              <w:rPr>
+                <w:rFonts w:ascii="Courier New" w:cs="Courier New" w:eastAsia="Courier New" w:hAnsi="Courier New"/>
+                <w:sz w:val="17"/>
+                <w:szCs w:val="17"/>
+              </w:rPr>
+              <w:t xml:space="preserve">    --solvent water \</w:t>
+            </w:r>
+          </w:p>
+          <w:p>
+            <w:pPr>
+              <w:spacing w:after="20"/>
+            </w:pPr>
+            <w:r>
+              <w:rPr>
+                <w:rFonts w:ascii="Courier New" w:cs="Courier New" w:eastAsia="Courier New" w:hAnsi="Courier New"/>
+                <w:sz w:val="17"/>
+                <w:szCs w:val="17"/>
+              </w:rPr>
+              <w:t xml:space="preserve">    --roots 20 \</w:t>
+            </w:r>
+          </w:p>
+          <w:p>
+            <w:pPr>
+              <w:spacing w:after="20"/>
+            </w:pPr>
+            <w:r>
+              <w:rPr>
+                <w:rFonts w:ascii="Courier New" w:cs="Courier New" w:eastAsia="Courier New" w:hAnsi="Courier New"/>
+                <w:sz w:val="17"/>
+                <w:szCs w:val="17"/>
+              </w:rPr>
+              <w:t xml:space="preserve">    --cpus 4 \</w:t>
             </w:r>
           </w:p>
           <w:p>
@@ -2295,7 +2295,7 @@
           <w:sz w:val="20"/>
           <w:szCs w:val="20"/>
         </w:rPr>
-        <w:t xml:space="preserve">The --nroots 20 flag tells ORCA to compute the lowest 20 excited states. This ensures we capture all transitions in the near-UV/visible region. The --disp flag defaults to "auto", which applies appropriate dispersion for the chosen functional.</w:t>
+        <w:t xml:space="preserve">The --roots 20 flag tells ORCA to compute the lowest 20 excited states. This ensures we capture all transitions in the near-UV/visible region. The --disp flag defaults to "auto", which applies appropriate dispersion for the chosen functional.</w:t>
       </w:r>
     </w:p>
     <w:tbl>
@@ -2375,7 +2375,7 @@
           <w:sz w:val="24"/>
           <w:szCs w:val="24"/>
         </w:rPr>
-        <w:t xml:space="preserve">Stage 6: Extract Spectral Data</w:t>
+        <w:t xml:space="preserve">Plotting: Generate UV-Vis Spectrum</w:t>
       </w:r>
     </w:p>
     <w:p>
@@ -2388,7 +2388,7 @@
           <w:sz w:val="20"/>
           <w:szCs w:val="20"/>
         </w:rPr>
-        <w:t xml:space="preserve">This script parses the ORCA TDDFT output files and extracts the excitation energies, oscillator strengths, and rotatory strengths into a structured format.</w:t>
+        <w:t xml:space="preserve">The Python plotting tool parses ORCA TDDFT output files, applies Boltzmann weighting, performs Gaussian broadening, and produces publication-quality plots and CSV data tables in one step.</w:t>
       </w:r>
     </w:p>
     <w:tbl>
@@ -2434,7 +2434,7 @@
                 <w:sz w:val="17"/>
                 <w:szCs w:val="17"/>
               </w:rPr>
-              <w:t xml:space="preserve">./6_data_extract_ecd.sh molecules.txt</w:t>
+              <w:t xml:space="preserve">python3 or_ecd_uvvis_tools.py pna/05_ecd/**/*.log --bw pna/04_boltzmann/pna_energies.dat --outdir pna --stick --xlim 200 500</w:t>
             </w:r>
           </w:p>
         </w:tc>
@@ -2450,7 +2450,7 @@
           <w:sz w:val="20"/>
           <w:szCs w:val="20"/>
         </w:rPr>
-        <w:t xml:space="preserve">The extracted data is written to spec_data/spec_data_pna/. Examine one of the output files to see the raw stick spectrum data (excitation wavelengths and intensities).</w:t>
+        <w:t xml:space="preserve">This generates PNG and PDF plots plus CSV data tables. The --stick flag overlays the raw computed transitions before broadening. Adjust the broadening width with --uv_fwhm (default 0.35 eV).</w:t>
       </w:r>
     </w:p>
     <w:p>
@@ -2466,7 +2466,7 @@
           <w:sz w:val="24"/>
           <w:szCs w:val="24"/>
         </w:rPr>
-        <w:t xml:space="preserve">Stage 7: Boltzmann-Weight the Spectral Data</w:t>
+        <w:t xml:space="preserve"> </w:t>
       </w:r>
     </w:p>
     <w:p>
@@ -2479,7 +2479,7 @@
           <w:sz w:val="20"/>
           <w:szCs w:val="20"/>
         </w:rPr>
-        <w:t xml:space="preserve">This script multiplies each conformer's stick spectrum by its Boltzmann probability and writes the weighted data to the spectra_input/ directory. For PNA with one conformer at 100% population, the weighted and unweighted spectra are identical.</w:t>
+        <w:t xml:space="preserve">This script multiplies each conformer's stick spectrum by its Boltzmann probability and writes the weighted data to the 06_spectra/ directory. For PNA with one conformer at 100% population, the weighted and unweighted spectra are identical.</w:t>
       </w:r>
     </w:p>
     <w:tbl>
@@ -2525,7 +2525,7 @@
                 <w:sz w:val="17"/>
                 <w:szCs w:val="17"/>
               </w:rPr>
-              <w:t xml:space="preserve">./7_spectra_prep_ecd.sh molecules.txt</w:t>
+              <w:t xml:space="preserve"> </w:t>
             </w:r>
           </w:p>
         </w:tc>
@@ -2544,7 +2544,7 @@
           <w:sz w:val="24"/>
           <w:szCs w:val="24"/>
         </w:rPr>
-        <w:t xml:space="preserve">Stage 8: Plot the Spectrum</w:t>
+        <w:t xml:space="preserve"> </w:t>
       </w:r>
     </w:p>
     <w:p>
@@ -2557,7 +2557,7 @@
           <w:sz w:val="20"/>
           <w:szCs w:val="20"/>
         </w:rPr>
-        <w:t xml:space="preserve">Finally, the plotting script applies Gaussian broadening to the weighted stick spectrum and produces a publication-quality UV-Vis plot.</w:t>
+        <w:t xml:space="preserve"> </w:t>
       </w:r>
     </w:p>
     <w:tbl>
@@ -2603,59 +2603,59 @@
                 <w:sz w:val="17"/>
                 <w:szCs w:val="17"/>
               </w:rPr>
-              <w:t xml:space="preserve">python3 8_plot_ecd_uvvis.py \</w:t>
-            </w:r>
-          </w:p>
-          <w:p>
-            <w:pPr>
-              <w:spacing w:after="20"/>
-            </w:pPr>
-            <w:r>
-              <w:rPr>
-                <w:rFonts w:ascii="Courier New" w:cs="Courier New" w:eastAsia="Courier New" w:hAnsi="Courier New"/>
-                <w:sz w:val="17"/>
-                <w:szCs w:val="17"/>
-              </w:rPr>
-              <w:t xml:space="preserve">    --type uv \</w:t>
-            </w:r>
-          </w:p>
-          <w:p>
-            <w:pPr>
-              <w:spacing w:after="20"/>
-            </w:pPr>
-            <w:r>
-              <w:rPr>
-                <w:rFonts w:ascii="Courier New" w:cs="Courier New" w:eastAsia="Courier New" w:hAnsi="Courier New"/>
-                <w:sz w:val="17"/>
-                <w:szCs w:val="17"/>
-              </w:rPr>
-              <w:t xml:space="preserve">    --directories spectra_input/spec_input_pna/uv_vis \</w:t>
-            </w:r>
-          </w:p>
-          <w:p>
-            <w:pPr>
-              <w:spacing w:after="20"/>
-            </w:pPr>
-            <w:r>
-              <w:rPr>
-                <w:rFonts w:ascii="Courier New" w:cs="Courier New" w:eastAsia="Courier New" w:hAnsi="Courier New"/>
-                <w:sz w:val="17"/>
-                <w:szCs w:val="17"/>
-              </w:rPr>
-              <w:t xml:space="preserve">    --fwhm 0.3 \</w:t>
-            </w:r>
-          </w:p>
-          <w:p>
-            <w:pPr>
-              <w:spacing w:after="20"/>
-            </w:pPr>
-            <w:r>
-              <w:rPr>
-                <w:rFonts w:ascii="Courier New" w:cs="Courier New" w:eastAsia="Courier New" w:hAnsi="Courier New"/>
-                <w:sz w:val="17"/>
-                <w:szCs w:val="17"/>
-              </w:rPr>
-              <w:t xml:space="preserve">    --xmin 200 --xmax 500</w:t>
+              <w:t xml:space="preserve"> </w:t>
+            </w:r>
+          </w:p>
+          <w:p>
+            <w:pPr>
+              <w:spacing w:after="20"/>
+            </w:pPr>
+            <w:r>
+              <w:rPr>
+                <w:rFonts w:ascii="Courier New" w:cs="Courier New" w:eastAsia="Courier New" w:hAnsi="Courier New"/>
+                <w:sz w:val="17"/>
+                <w:szCs w:val="17"/>
+              </w:rPr>
+              <w:t xml:space="preserve">  \</w:t>
+            </w:r>
+          </w:p>
+          <w:p>
+            <w:pPr>
+              <w:spacing w:after="20"/>
+            </w:pPr>
+            <w:r>
+              <w:rPr>
+                <w:rFonts w:ascii="Courier New" w:cs="Courier New" w:eastAsia="Courier New" w:hAnsi="Courier New"/>
+                <w:sz w:val="17"/>
+                <w:szCs w:val="17"/>
+              </w:rPr>
+              <w:t xml:space="preserve">  \</w:t>
+            </w:r>
+          </w:p>
+          <w:p>
+            <w:pPr>
+              <w:spacing w:after="20"/>
+            </w:pPr>
+            <w:r>
+              <w:rPr>
+                <w:rFonts w:ascii="Courier New" w:cs="Courier New" w:eastAsia="Courier New" w:hAnsi="Courier New"/>
+                <w:sz w:val="17"/>
+                <w:szCs w:val="17"/>
+              </w:rPr>
+              <w:t xml:space="preserve">    \</w:t>
+            </w:r>
+          </w:p>
+          <w:p>
+            <w:pPr>
+              <w:spacing w:after="20"/>
+            </w:pPr>
+            <w:r>
+              <w:rPr>
+                <w:rFonts w:ascii="Courier New" w:cs="Courier New" w:eastAsia="Courier New" w:hAnsi="Courier New"/>
+                <w:sz w:val="17"/>
+                <w:szCs w:val="17"/>
+              </w:rPr>
+              <w:t xml:space="preserve">   </w:t>
             </w:r>
           </w:p>
         </w:tc>
@@ -2671,7 +2671,7 @@
           <w:sz w:val="20"/>
           <w:szCs w:val="20"/>
         </w:rPr>
-        <w:t xml:space="preserve">This generates a PNG file (pna_uv.png) containing the broadened UV-Vis absorption spectrum. The --fwhm flag controls the full width at half maximum of the Gaussian broadening function, which determines how broad each absorption band appears. A value of 0.3 eV is a reasonable starting point.</w:t>
+        <w:t xml:space="preserve">Open the generated plots in pna/06_spectra/ to see the broadened UV-Vis absorption spectrum.</w:t>
       </w:r>
     </w:p>
     <w:tbl>
@@ -2832,7 +2832,7 @@
           <w:sz w:val="20"/>
           <w:szCs w:val="20"/>
         </w:rPr>
-        <w:t xml:space="preserve">Re-run Stage 5 (and then Stages 6–8) with each of the following functionals, keeping the basis set at def2-TZVP and the solvent as CPCM(WATER). To avoid overwriting your baseline results, create a separate working directory for each functional or rename the output directories between runs.</w:t>
+        <w:t xml:space="preserve">Re-run Stage 5 (and then Stages 6-8) with each of the following functionals, keeping the basis set at def2-TZVP and the solvent as CPCM(WATER). To avoid overwriting your baseline results, create a separate working directory for each functional or rename the output directories between runs.</w:t>
       </w:r>
     </w:p>
     <w:p>
@@ -2904,20 +2904,20 @@
                 <w:sz w:val="17"/>
                 <w:szCs w:val="17"/>
               </w:rPr>
-              <w:t xml:space="preserve">cp -r pna/bw_results pna_b3lyp_tddft/bw_results</w:t>
-            </w:r>
-          </w:p>
-          <w:p>
-            <w:pPr>
-              <w:spacing w:after="20"/>
-            </w:pPr>
-            <w:r>
-              <w:rPr>
-                <w:rFonts w:ascii="Courier New" w:cs="Courier New" w:eastAsia="Courier New" w:hAnsi="Courier New"/>
-                <w:sz w:val="17"/>
-                <w:szCs w:val="17"/>
-              </w:rPr>
-              <w:t xml:space="preserve">cp -r pna/solv_init_opt pna_b3lyp_tddft/solv_init_opt</w:t>
+              <w:t xml:space="preserve">cp -r pna/04_boltzmann pna_b3lyp_tddft/04_boltzmann</w:t>
+            </w:r>
+          </w:p>
+          <w:p>
+            <w:pPr>
+              <w:spacing w:after="20"/>
+            </w:pPr>
+            <w:r>
+              <w:rPr>
+                <w:rFonts w:ascii="Courier New" w:cs="Courier New" w:eastAsia="Courier New" w:hAnsi="Courier New"/>
+                <w:sz w:val="17"/>
+                <w:szCs w:val="17"/>
+              </w:rPr>
+              <w:t xml:space="preserve">cp -r pna/03_solvent_opt pna_b3lyp_tddft/03_solvent_opt</w:t>
             </w:r>
           </w:p>
           <w:p>
@@ -2943,7 +2943,7 @@
                 <w:sz w:val="17"/>
                 <w:szCs w:val="17"/>
               </w:rPr>
-              <w:t xml:space="preserve"># Or rename directories as needed before re-running Scripts 5-8</w:t>
+              <w:t xml:space="preserve"># Or rename directories as needed before re-running Stages 6 and plotting</w:t>
             </w:r>
           </w:p>
         </w:tc>
@@ -3020,20 +3020,20 @@
                 <w:sz w:val="17"/>
                 <w:szCs w:val="17"/>
               </w:rPr>
-              <w:t xml:space="preserve">./5_orca_tddft.sh --func B3LYP --basis def2-TZVP \</w:t>
-            </w:r>
-          </w:p>
-          <w:p>
-            <w:pPr>
-              <w:spacing w:after="20"/>
-            </w:pPr>
-            <w:r>
-              <w:rPr>
-                <w:rFonts w:ascii="Courier New" w:cs="Courier New" w:eastAsia="Courier New" w:hAnsi="Courier New"/>
-                <w:sz w:val="17"/>
-                <w:szCs w:val="17"/>
-              </w:rPr>
-              <w:t xml:space="preserve">    --solv-model CPCM --solvent WATER --nroots 20 --nprocs 4 molecules.txt</w:t>
+              <w:t xml:space="preserve">./6-orca-ecd.sh --method B3LYP --basis def2-TZVP \</w:t>
+            </w:r>
+          </w:p>
+          <w:p>
+            <w:pPr>
+              <w:spacing w:after="20"/>
+            </w:pPr>
+            <w:r>
+              <w:rPr>
+                <w:rFonts w:ascii="Courier New" w:cs="Courier New" w:eastAsia="Courier New" w:hAnsi="Courier New"/>
+                <w:sz w:val="17"/>
+                <w:szCs w:val="17"/>
+              </w:rPr>
+              <w:t xml:space="preserve">    --solvent water --roots 20 --cpus 4 molecules.txt</w:t>
             </w:r>
           </w:p>
         </w:tc>
@@ -3097,20 +3097,20 @@
                 <w:sz w:val="17"/>
                 <w:szCs w:val="17"/>
               </w:rPr>
-              <w:t xml:space="preserve">./5_orca_tddft.sh --func PBE0 --basis def2-TZVP \</w:t>
-            </w:r>
-          </w:p>
-          <w:p>
-            <w:pPr>
-              <w:spacing w:after="20"/>
-            </w:pPr>
-            <w:r>
-              <w:rPr>
-                <w:rFonts w:ascii="Courier New" w:cs="Courier New" w:eastAsia="Courier New" w:hAnsi="Courier New"/>
-                <w:sz w:val="17"/>
-                <w:szCs w:val="17"/>
-              </w:rPr>
-              <w:t xml:space="preserve">    --solv-model CPCM --solvent WATER --nroots 20 --nprocs 4 molecules.txt</w:t>
+              <w:t xml:space="preserve">./6-orca-ecd.sh --method PBE0 --basis def2-TZVP \</w:t>
+            </w:r>
+          </w:p>
+          <w:p>
+            <w:pPr>
+              <w:spacing w:after="20"/>
+            </w:pPr>
+            <w:r>
+              <w:rPr>
+                <w:rFonts w:ascii="Courier New" w:cs="Courier New" w:eastAsia="Courier New" w:hAnsi="Courier New"/>
+                <w:sz w:val="17"/>
+                <w:szCs w:val="17"/>
+              </w:rPr>
+              <w:t xml:space="preserve">    --solvent water --roots 20 --cpus 4 molecules.txt</w:t>
             </w:r>
           </w:p>
         </w:tc>
@@ -3128,7 +3128,7 @@
           <w:sz w:val="22"/>
           <w:szCs w:val="22"/>
         </w:rPr>
-        <w:t xml:space="preserve">c) CAM-B3LYP (range-separated hybrid, 19–65% HF exchange)</w:t>
+        <w:t xml:space="preserve">c) CAM-B3LYP (range-separated hybrid, 19-65% HF exchange)</w:t>
       </w:r>
     </w:p>
     <w:tbl>
@@ -3174,20 +3174,20 @@
                 <w:sz w:val="17"/>
                 <w:szCs w:val="17"/>
               </w:rPr>
-              <w:t xml:space="preserve">./5_orca_tddft.sh --func CAM-B3LYP --basis def2-TZVP \</w:t>
-            </w:r>
-          </w:p>
-          <w:p>
-            <w:pPr>
-              <w:spacing w:after="20"/>
-            </w:pPr>
-            <w:r>
-              <w:rPr>
-                <w:rFonts w:ascii="Courier New" w:cs="Courier New" w:eastAsia="Courier New" w:hAnsi="Courier New"/>
-                <w:sz w:val="17"/>
-                <w:szCs w:val="17"/>
-              </w:rPr>
-              <w:t xml:space="preserve">    --solv-model CPCM --solvent WATER --nroots 20 --nprocs 4 molecules.txt</w:t>
+              <w:t xml:space="preserve">./6-orca-ecd.sh --method CAM-B3LYP --basis def2-TZVP \</w:t>
+            </w:r>
+          </w:p>
+          <w:p>
+            <w:pPr>
+              <w:spacing w:after="20"/>
+            </w:pPr>
+            <w:r>
+              <w:rPr>
+                <w:rFonts w:ascii="Courier New" w:cs="Courier New" w:eastAsia="Courier New" w:hAnsi="Courier New"/>
+                <w:sz w:val="17"/>
+                <w:szCs w:val="17"/>
+              </w:rPr>
+              <w:t xml:space="preserve">    --solvent water --roots 20 --cpus 4 molecules.txt</w:t>
             </w:r>
           </w:p>
         </w:tc>
@@ -3231,7 +3231,7 @@
           <w:sz w:val="20"/>
           <w:szCs w:val="20"/>
         </w:rPr>
-        <w:t xml:space="preserve">After each TDDFT run, re-run Stages 6–8 to extract and plot the spectrum. Record the dominant absorption wavelength (λmax) and oscillator strength (f) for each functional in the table below.</w:t>
+        <w:t xml:space="preserve">After each TDDFT run, re-run the plotting step to generate the spectrum. Record the dominant absorption wavelength (λmax) and oscillator strength (f) for each functional in the table below.</w:t>
       </w:r>
     </w:p>
     <w:p>
@@ -3975,7 +3975,7 @@
                 <w:sz w:val="18"/>
                 <w:szCs w:val="18"/>
               </w:rPr>
-              <w:t xml:space="preserve">—</w:t>
+              <w:t xml:space="preserve">-</w:t>
             </w:r>
           </w:p>
         </w:tc>
@@ -4006,7 +4006,7 @@
                 <w:sz w:val="18"/>
                 <w:szCs w:val="18"/>
               </w:rPr>
-              <w:t xml:space="preserve">—</w:t>
+              <w:t xml:space="preserve">-</w:t>
             </w:r>
           </w:p>
         </w:tc>
@@ -4282,7 +4282,7 @@
           <w:sz w:val="20"/>
           <w:szCs w:val="20"/>
         </w:rPr>
-        <w:t xml:space="preserve">If time allows, re-run the complete workflow (Stages 3–8) using a different solvent to observe the solvatochromic shift of the PNA absorption band. For example, re-optimize and compute the spectrum in cyclohexane (a nonpolar solvent):</w:t>
+        <w:t xml:space="preserve">If time allows, re-run the complete workflow (Stages 3-8) using a different solvent to observe the solvatochromic shift of the PNA absorption band. For example, re-optimize and compute the spectrum in cyclohexane (a nonpolar solvent):</w:t>
       </w:r>
     </w:p>
     <w:tbl>
@@ -4341,20 +4341,20 @@
                 <w:sz w:val="17"/>
                 <w:szCs w:val="17"/>
               </w:rPr>
-              <w:t xml:space="preserve">./3_orca_solventopt.sh --method B3LYP --disp D3BJ --basis def2-SVP \</w:t>
-            </w:r>
-          </w:p>
-          <w:p>
-            <w:pPr>
-              <w:spacing w:after="20"/>
-            </w:pPr>
-            <w:r>
-              <w:rPr>
-                <w:rFonts w:ascii="Courier New" w:cs="Courier New" w:eastAsia="Courier New" w:hAnsi="Courier New"/>
-                <w:sz w:val="17"/>
-                <w:szCs w:val="17"/>
-              </w:rPr>
-              <w:t xml:space="preserve">    --solv-model CPCM --solvent CYCLOHEXANE --nprocs 4 molecules.txt</w:t>
+              <w:t xml:space="preserve">./4-orca-solvent-opt.sh --method B3LYP --disp D3BJ --basis def2-SVP \</w:t>
+            </w:r>
+          </w:p>
+          <w:p>
+            <w:pPr>
+              <w:spacing w:after="20"/>
+            </w:pPr>
+            <w:r>
+              <w:rPr>
+                <w:rFonts w:ascii="Courier New" w:cs="Courier New" w:eastAsia="Courier New" w:hAnsi="Courier New"/>
+                <w:sz w:val="17"/>
+                <w:szCs w:val="17"/>
+              </w:rPr>
+              <w:t xml:space="preserve">    --solvent cyclohexane --cpus 4 molecules.txt</w:t>
             </w:r>
           </w:p>
           <w:p>
@@ -4393,20 +4393,20 @@
                 <w:sz w:val="17"/>
                 <w:szCs w:val="17"/>
               </w:rPr>
-              <w:t xml:space="preserve">./5_orca_tddft.sh --func wB97X-D3 --basis def2-TZVP \</w:t>
-            </w:r>
-          </w:p>
-          <w:p>
-            <w:pPr>
-              <w:spacing w:after="20"/>
-            </w:pPr>
-            <w:r>
-              <w:rPr>
-                <w:rFonts w:ascii="Courier New" w:cs="Courier New" w:eastAsia="Courier New" w:hAnsi="Courier New"/>
-                <w:sz w:val="17"/>
-                <w:szCs w:val="17"/>
-              </w:rPr>
-              <w:t xml:space="preserve">    --solv-model CPCM --solvent CYCLOHEXANE --nroots 20 --nprocs 4 molecules.txt</w:t>
+              <w:t xml:space="preserve">./6-orca-ecd.sh --method wB97X-D3 --basis def2-TZVP \</w:t>
+            </w:r>
+          </w:p>
+          <w:p>
+            <w:pPr>
+              <w:spacing w:after="20"/>
+            </w:pPr>
+            <w:r>
+              <w:rPr>
+                <w:rFonts w:ascii="Courier New" w:cs="Courier New" w:eastAsia="Courier New" w:hAnsi="Courier New"/>
+                <w:sz w:val="17"/>
+                <w:szCs w:val="17"/>
+              </w:rPr>
+              <w:t xml:space="preserve">    --solvent cyclohexane --roots 20 --cpus 4 molecules.txt</w:t>
             </w:r>
           </w:p>
         </w:tc>
@@ -4515,7 +4515,7 @@
           <w:sz w:val="20"/>
           <w:szCs w:val="20"/>
         </w:rPr>
-        <w:t xml:space="preserve">Compile your results into a short report (2–3 pages) that includes the following elements:</w:t>
+        <w:t xml:space="preserve">Compile your results into a short report (2-3 pages) that includes the following elements:</w:t>
       </w:r>
     </w:p>
     <w:p>
@@ -4644,7 +4644,7 @@
           <w:sz w:val="19"/>
           <w:szCs w:val="19"/>
         </w:rPr>
-        <w:t xml:space="preserve">Laurent, A. D.; Jacquemin, D. TD-DFT Benchmarks: A Review. Int. J. Quantum Chem. 2013, 113, 2019–2039.</w:t>
+        <w:t xml:space="preserve">Laurent, A. D.; Jacquemin, D. TD-DFT Benchmarks: A Review. Int. J. Quantum Chem. 2013, 113, 2019-2039.</w:t>
       </w:r>
     </w:p>
     <w:p>
@@ -4680,7 +4680,7 @@
           <w:sz w:val="19"/>
           <w:szCs w:val="19"/>
         </w:rPr>
-        <w:t xml:space="preserve">Guido, C. A.; Jacquemin, D.; Adamo, C.; Mennucci, B. Electronic Excitations in Solution. J. Chem. Theory Comput. 2015, 11, 5782–5790.</w:t>
+        <w:t xml:space="preserve">Guido, C. A.; Jacquemin, D.; Adamo, C.; Mennucci, B. Electronic Excitations in Solution. J. Chem. Theory Comput. 2015, 11, 5782-5790.</w:t>
       </w:r>
     </w:p>
     <w:p>
@@ -4746,7 +4746,7 @@
                 <w:sz w:val="19"/>
                 <w:szCs w:val="19"/>
               </w:rPr>
-              <w:t xml:space="preserve">Script 1: ./1_orca_gasopt.sh [--method --basis --disp --nprocs] molecules.txt</w:t>
+              <w:t xml:space="preserve">Stage 1: ./1-orca-init-opt.sh [--method --basis --disp --cpus] molecules.txt</w:t>
             </w:r>
           </w:p>
           <w:p>
@@ -4759,7 +4759,7 @@
                 <w:sz w:val="19"/>
                 <w:szCs w:val="19"/>
               </w:rPr>
-              <w:t xml:space="preserve">Script 2: ./2_confab.sh [--ecutoff --max-confs] molecules.txt</w:t>
+              <w:t xml:space="preserve">Stage 2: ./2-orca-conf-search.sh [--ecut --conf] molecules.txt</w:t>
             </w:r>
           </w:p>
           <w:p>
@@ -4772,7 +4772,7 @@
                 <w:sz w:val="19"/>
                 <w:szCs w:val="19"/>
               </w:rPr>
-              <w:t xml:space="preserve">Script 3: ./3_orca_solventopt.sh [--method --basis --disp --solv-model --solvent --nprocs] molecules.txt</w:t>
+              <w:t xml:space="preserve">Stage 4: ./4-orca-solvent-opt.sh [--method --basis --disp --solvent --cpus] molecules.txt</w:t>
             </w:r>
           </w:p>
           <w:p>
@@ -4785,7 +4785,7 @@
                 <w:sz w:val="19"/>
                 <w:szCs w:val="19"/>
               </w:rPr>
-              <w:t xml:space="preserve">Script 4: ./4_boltzmann_filter.sh [--temp --thresh] molecules.txt</w:t>
+              <w:t xml:space="preserve">Stage 5: ./5-orca-boltzmann-weight.sh [--temp --p-cut] molecules.txt</w:t>
             </w:r>
           </w:p>
           <w:p>
@@ -4798,7 +4798,7 @@
                 <w:sz w:val="19"/>
                 <w:szCs w:val="19"/>
               </w:rPr>
-              <w:t xml:space="preserve">Script 5: ./5_orca_tddft.sh [--func --basis --disp --solv-model --solvent --nroots --nprocs] molecules.txt</w:t>
+              <w:t xml:space="preserve">Stage 6: ./6-orca-ecd.sh [--method --basis --disp --solvent --roots --cpus] molecules.txt</w:t>
             </w:r>
           </w:p>
           <w:p>
@@ -4811,7 +4811,7 @@
                 <w:sz w:val="19"/>
                 <w:szCs w:val="19"/>
               </w:rPr>
-              <w:t xml:space="preserve">Script 6: ./6_data_extract_ecd.sh molecules.txt</w:t>
+              <w:t xml:space="preserve">Plot:  </w:t>
             </w:r>
           </w:p>
           <w:p>
@@ -4824,7 +4824,7 @@
                 <w:sz w:val="19"/>
                 <w:szCs w:val="19"/>
               </w:rPr>
-              <w:t xml:space="preserve">Script 7: ./7_spectra_prep_ecd.sh molecules.txt</w:t>
+              <w:t xml:space="preserve">Plot:  </w:t>
             </w:r>
           </w:p>
           <w:p>
@@ -4837,7 +4837,7 @@
                 <w:sz w:val="19"/>
                 <w:szCs w:val="19"/>
               </w:rPr>
-              <w:t xml:space="preserve">Script 8: python3 8_plot_ecd_uvvis.py --type uv --directories &lt;path&gt; --fwhm 0.3 --xmin 200 --xmax 500</w:t>
+              <w:t xml:space="preserve">Plot: python3 or_ecd_uvvis_tools.py pna/05_ecd/**/*.log --bw pna/04_boltzmann/pna_energies.dat --outdir pna --stick</w:t>
             </w:r>
           </w:p>
         </w:tc>

</xml_diff>

<commit_message>
Updated comment sections and echo output
</commit_message>
<xml_diff>
--- a/Session1_UVVis_Benchmarking_Handout.docx
+++ b/Session1_UVVis_Benchmarking_Handout.docx
@@ -484,7 +484,7 @@
                 <w:sz w:val="17"/>
                 <w:szCs w:val="17"/>
               </w:rPr>
-              <w:t xml:space="preserve">         or_ecd_uvvis_tools.py or_ecd_uvvis_tools.py</w:t>
+              <w:t xml:space="preserve">         or_ecd_uvvis_tools.py or_vcd_ir_tools.py</w:t>
             </w:r>
           </w:p>
         </w:tc>
@@ -1634,7 +1634,7 @@
                 <w:sz w:val="17"/>
                 <w:szCs w:val="17"/>
               </w:rPr>
-              <w:t xml:space="preserve">    \</w:t>
+              <w:t xml:space="preserve">    --grid 3 \</w:t>
             </w:r>
           </w:p>
           <w:p>
@@ -1802,7 +1802,7 @@
                 <w:sz w:val="19"/>
                 <w:szCs w:val="19"/>
               </w:rPr>
-              <w:t xml:space="preserve">You can switch between them using the flag.</w:t>
+              <w:t xml:space="preserve">You can switch between them using the --solvent-model flag (cpcm or smd).</w:t>
             </w:r>
           </w:p>
         </w:tc>
@@ -2111,7 +2111,7 @@
                 <w:sz w:val="17"/>
                 <w:szCs w:val="17"/>
               </w:rPr>
-              <w:t xml:space="preserve">    \</w:t>
+              <w:t xml:space="preserve">    --grid 3 \</w:t>
             </w:r>
           </w:p>
           <w:p>
@@ -2455,22 +2455,6 @@
     </w:p>
     <w:p>
       <w:pPr>
-        <w:pStyle w:val="Heading2"/>
-        <w:spacing w:before="280" w:after="120"/>
-      </w:pPr>
-      <w:r>
-        <w:rPr>
-          <w:rFonts w:ascii="Arial" w:cs="Arial" w:eastAsia="Arial" w:hAnsi="Arial"/>
-          <w:b/>
-          <w:bCs/>
-          <w:sz w:val="24"/>
-          <w:szCs w:val="24"/>
-        </w:rPr>
-        <w:t xml:space="preserve"> </w:t>
-      </w:r>
-    </w:p>
-    <w:p>
-      <w:pPr>
         <w:spacing w:after="120"/>
       </w:pPr>
       <w:r>
@@ -2479,7 +2463,20 @@
           <w:sz w:val="20"/>
           <w:szCs w:val="20"/>
         </w:rPr>
-        <w:t xml:space="preserve">This script multiplies each conformer's stick spectrum by its Boltzmann probability and writes the weighted data to the 06_spectra/ directory. For PNA with one conformer at 100% population, the weighted and unweighted spectra are identical.</w:t>
+        <w:t xml:space="preserve">The plotting tool multiplies each conformer's stick spectrum by its Boltzmann probability and writes the weighted data to the 06_spectra/ directory. For PNA with one conformer at 100% population, the weighted and unweighted spectra are identical.</w:t>
+      </w:r>
+    </w:p>
+    <w:p>
+      <w:pPr>
+        <w:spacing w:after="120"/>
+      </w:pPr>
+      <w:r>
+        <w:rPr>
+          <w:rFonts w:ascii="Arial" w:cs="Arial" w:eastAsia="Arial" w:hAnsi="Arial"/>
+          <w:sz w:val="20"/>
+          <w:szCs w:val="20"/>
+        </w:rPr>
+        <w:t xml:space="preserve">Open the generated plots in pna/06_spectra/ to see the broadened UV-Vis absorption spectrum.</w:t>
       </w:r>
     </w:p>
     <w:tbl>
@@ -2507,7 +2504,7 @@
               <w:bottom w:val="single" w:color="AAAAAA" w:sz="1"/>
               <w:right w:val="single" w:color="AAAAAA" w:sz="1"/>
             </w:tcBorders>
-            <w:shd w:fill="F2F2F2" w:val="clear"/>
+            <w:shd w:fill="D4EDDA" w:val="clear"/>
             <w:tcMar>
               <w:top w:type="dxa" w:w="80"/>
               <w:left w:type="dxa" w:w="160"/>
@@ -2517,20 +2514,103 @@
           </w:tcPr>
           <w:p>
             <w:pPr>
-              <w:spacing w:after="20"/>
-            </w:pPr>
-            <w:r>
-              <w:rPr>
-                <w:rFonts w:ascii="Courier New" w:cs="Courier New" w:eastAsia="Courier New" w:hAnsi="Courier New"/>
-                <w:sz w:val="17"/>
-                <w:szCs w:val="17"/>
-              </w:rPr>
-              <w:t xml:space="preserve"> </w:t>
+              <w:spacing w:after="60"/>
+            </w:pPr>
+            <w:r>
+              <w:rPr>
+                <w:rFonts w:ascii="Arial" w:cs="Arial" w:eastAsia="Arial" w:hAnsi="Arial"/>
+                <w:b/>
+                <w:bCs/>
+                <w:sz w:val="20"/>
+                <w:szCs w:val="20"/>
+              </w:rPr>
+              <w:t xml:space="preserve">Check your result</w:t>
+            </w:r>
+          </w:p>
+          <w:p>
+            <w:pPr>
+              <w:spacing w:after="40"/>
+            </w:pPr>
+            <w:r>
+              <w:rPr>
+                <w:rFonts w:ascii="Arial" w:cs="Arial" w:eastAsia="Arial" w:hAnsi="Arial"/>
+                <w:sz w:val="19"/>
+                <w:szCs w:val="19"/>
+              </w:rPr>
+              <w:t xml:space="preserve">Open pna_uv.png and identify the dominant absorption band.</w:t>
+            </w:r>
+          </w:p>
+          <w:p>
+            <w:pPr>
+              <w:spacing w:after="40"/>
+            </w:pPr>
+            <w:r>
+              <w:rPr>
+                <w:rFonts w:ascii="Arial" w:cs="Arial" w:eastAsia="Arial" w:hAnsi="Arial"/>
+                <w:sz w:val="19"/>
+                <w:szCs w:val="19"/>
+              </w:rPr>
+              <w:t xml:space="preserve">Record its wavelength. The experimental absorption maximum for PNA in water is</w:t>
+            </w:r>
+          </w:p>
+          <w:p>
+            <w:pPr>
+              <w:spacing w:after="40"/>
+            </w:pPr>
+            <w:r>
+              <w:rPr>
+                <w:rFonts w:ascii="Arial" w:cs="Arial" w:eastAsia="Arial" w:hAnsi="Arial"/>
+                <w:sz w:val="19"/>
+                <w:szCs w:val="19"/>
+              </w:rPr>
+              <w:t xml:space="preserve">approximately 370 nm. How close is your computed value?</w:t>
+            </w:r>
+          </w:p>
+          <w:p>
+            <w:pPr>
+              <w:spacing w:after="40"/>
+            </w:pPr>
+            <w:r>
+              <w:rPr>
+                <w:rFonts w:ascii="Arial" w:cs="Arial" w:eastAsia="Arial" w:hAnsi="Arial"/>
+                <w:sz w:val="19"/>
+                <w:szCs w:val="19"/>
+              </w:rPr>
+              <w:t xml:space="preserve">Also note any secondary bands at shorter wavelengths.</w:t>
             </w:r>
           </w:p>
         </w:tc>
       </w:tr>
     </w:tbl>
+    <w:p>
+      <w:pPr>
+        <w:pStyle w:val="Heading1"/>
+        <w:spacing w:before="360" w:after="160"/>
+      </w:pPr>
+      <w:r>
+        <w:rPr>
+          <w:rFonts w:ascii="Arial" w:cs="Arial" w:eastAsia="Arial" w:hAnsi="Arial"/>
+          <w:b/>
+          <w:bCs/>
+          <w:sz w:val="28"/>
+          <w:szCs w:val="28"/>
+        </w:rPr>
+        <w:t xml:space="preserve">Part 3: Functional and Basis Set Benchmarking</w:t>
+      </w:r>
+    </w:p>
+    <w:p>
+      <w:pPr>
+        <w:spacing w:after="120"/>
+      </w:pPr>
+      <w:r>
+        <w:rPr>
+          <w:rFonts w:ascii="Arial" w:cs="Arial" w:eastAsia="Arial" w:hAnsi="Arial"/>
+          <w:sz w:val="20"/>
+          <w:szCs w:val="20"/>
+        </w:rPr>
+        <w:t xml:space="preserve">Now that you have a baseline spectrum, the real learning begins. You will systematically vary the density functional and basis set in the TDDFT step (Stage 5) while keeping everything else constant, then compare how each choice affects the predicted absorption maximum. This exercise mirrors the kind of benchmarking study you would perform before using TDDFT predictions in a research context.</w:t>
+      </w:r>
+    </w:p>
     <w:p>
       <w:pPr>
         <w:pStyle w:val="Heading2"/>
@@ -2544,7 +2624,7 @@
           <w:sz w:val="24"/>
           <w:szCs w:val="24"/>
         </w:rPr>
-        <w:t xml:space="preserve"> </w:t>
+        <w:t xml:space="preserve">Exercise 3.1: Functional Comparison</w:t>
       </w:r>
     </w:p>
     <w:p>
@@ -2557,282 +2637,7 @@
           <w:sz w:val="20"/>
           <w:szCs w:val="20"/>
         </w:rPr>
-        <w:t xml:space="preserve"> </w:t>
-      </w:r>
-    </w:p>
-    <w:tbl>
-      <w:tblPr>
-        <w:tblW w:type="dxa" w:w="9360"/>
-        <w:tblBorders>
-          <w:top w:val="single" w:color="auto" w:sz="4"/>
-          <w:left w:val="single" w:color="auto" w:sz="4"/>
-          <w:bottom w:val="single" w:color="auto" w:sz="4"/>
-          <w:right w:val="single" w:color="auto" w:sz="4"/>
-          <w:insideH w:val="single" w:color="auto" w:sz="4"/>
-          <w:insideV w:val="single" w:color="auto" w:sz="4"/>
-        </w:tblBorders>
-      </w:tblPr>
-      <w:tblGrid>
-        <w:gridCol w:w="9360"/>
-      </w:tblGrid>
-      <w:tr>
-        <w:tc>
-          <w:tcPr>
-            <w:tcW w:type="dxa" w:w="9360"/>
-            <w:tcBorders>
-              <w:top w:val="single" w:color="AAAAAA" w:sz="1"/>
-              <w:left w:val="single" w:color="AAAAAA" w:sz="1"/>
-              <w:bottom w:val="single" w:color="AAAAAA" w:sz="1"/>
-              <w:right w:val="single" w:color="AAAAAA" w:sz="1"/>
-            </w:tcBorders>
-            <w:shd w:fill="F2F2F2" w:val="clear"/>
-            <w:tcMar>
-              <w:top w:type="dxa" w:w="80"/>
-              <w:left w:type="dxa" w:w="160"/>
-              <w:bottom w:type="dxa" w:w="80"/>
-              <w:right w:type="dxa" w:w="160"/>
-            </w:tcMar>
-          </w:tcPr>
-          <w:p>
-            <w:pPr>
-              <w:spacing w:after="20"/>
-            </w:pPr>
-            <w:r>
-              <w:rPr>
-                <w:rFonts w:ascii="Courier New" w:cs="Courier New" w:eastAsia="Courier New" w:hAnsi="Courier New"/>
-                <w:sz w:val="17"/>
-                <w:szCs w:val="17"/>
-              </w:rPr>
-              <w:t xml:space="preserve"> </w:t>
-            </w:r>
-          </w:p>
-          <w:p>
-            <w:pPr>
-              <w:spacing w:after="20"/>
-            </w:pPr>
-            <w:r>
-              <w:rPr>
-                <w:rFonts w:ascii="Courier New" w:cs="Courier New" w:eastAsia="Courier New" w:hAnsi="Courier New"/>
-                <w:sz w:val="17"/>
-                <w:szCs w:val="17"/>
-              </w:rPr>
-              <w:t xml:space="preserve">  \</w:t>
-            </w:r>
-          </w:p>
-          <w:p>
-            <w:pPr>
-              <w:spacing w:after="20"/>
-            </w:pPr>
-            <w:r>
-              <w:rPr>
-                <w:rFonts w:ascii="Courier New" w:cs="Courier New" w:eastAsia="Courier New" w:hAnsi="Courier New"/>
-                <w:sz w:val="17"/>
-                <w:szCs w:val="17"/>
-              </w:rPr>
-              <w:t xml:space="preserve">  \</w:t>
-            </w:r>
-          </w:p>
-          <w:p>
-            <w:pPr>
-              <w:spacing w:after="20"/>
-            </w:pPr>
-            <w:r>
-              <w:rPr>
-                <w:rFonts w:ascii="Courier New" w:cs="Courier New" w:eastAsia="Courier New" w:hAnsi="Courier New"/>
-                <w:sz w:val="17"/>
-                <w:szCs w:val="17"/>
-              </w:rPr>
-              <w:t xml:space="preserve">    \</w:t>
-            </w:r>
-          </w:p>
-          <w:p>
-            <w:pPr>
-              <w:spacing w:after="20"/>
-            </w:pPr>
-            <w:r>
-              <w:rPr>
-                <w:rFonts w:ascii="Courier New" w:cs="Courier New" w:eastAsia="Courier New" w:hAnsi="Courier New"/>
-                <w:sz w:val="17"/>
-                <w:szCs w:val="17"/>
-              </w:rPr>
-              <w:t xml:space="preserve">   </w:t>
-            </w:r>
-          </w:p>
-        </w:tc>
-      </w:tr>
-    </w:tbl>
-    <w:p>
-      <w:pPr>
-        <w:spacing w:after="120"/>
-      </w:pPr>
-      <w:r>
-        <w:rPr>
-          <w:rFonts w:ascii="Arial" w:cs="Arial" w:eastAsia="Arial" w:hAnsi="Arial"/>
-          <w:sz w:val="20"/>
-          <w:szCs w:val="20"/>
-        </w:rPr>
-        <w:t xml:space="preserve">Open the generated plots in pna/06_spectra/ to see the broadened UV-Vis absorption spectrum.</w:t>
-      </w:r>
-    </w:p>
-    <w:tbl>
-      <w:tblPr>
-        <w:tblW w:type="dxa" w:w="9360"/>
-        <w:tblBorders>
-          <w:top w:val="single" w:color="auto" w:sz="4"/>
-          <w:left w:val="single" w:color="auto" w:sz="4"/>
-          <w:bottom w:val="single" w:color="auto" w:sz="4"/>
-          <w:right w:val="single" w:color="auto" w:sz="4"/>
-          <w:insideH w:val="single" w:color="auto" w:sz="4"/>
-          <w:insideV w:val="single" w:color="auto" w:sz="4"/>
-        </w:tblBorders>
-      </w:tblPr>
-      <w:tblGrid>
-        <w:gridCol w:w="9360"/>
-      </w:tblGrid>
-      <w:tr>
-        <w:tc>
-          <w:tcPr>
-            <w:tcW w:type="dxa" w:w="9360"/>
-            <w:tcBorders>
-              <w:top w:val="single" w:color="AAAAAA" w:sz="1"/>
-              <w:left w:val="single" w:color="AAAAAA" w:sz="1"/>
-              <w:bottom w:val="single" w:color="AAAAAA" w:sz="1"/>
-              <w:right w:val="single" w:color="AAAAAA" w:sz="1"/>
-            </w:tcBorders>
-            <w:shd w:fill="D4EDDA" w:val="clear"/>
-            <w:tcMar>
-              <w:top w:type="dxa" w:w="80"/>
-              <w:left w:type="dxa" w:w="160"/>
-              <w:bottom w:type="dxa" w:w="80"/>
-              <w:right w:type="dxa" w:w="160"/>
-            </w:tcMar>
-          </w:tcPr>
-          <w:p>
-            <w:pPr>
-              <w:spacing w:after="60"/>
-            </w:pPr>
-            <w:r>
-              <w:rPr>
-                <w:rFonts w:ascii="Arial" w:cs="Arial" w:eastAsia="Arial" w:hAnsi="Arial"/>
-                <w:b/>
-                <w:bCs/>
-                <w:sz w:val="20"/>
-                <w:szCs w:val="20"/>
-              </w:rPr>
-              <w:t xml:space="preserve">Check your result</w:t>
-            </w:r>
-          </w:p>
-          <w:p>
-            <w:pPr>
-              <w:spacing w:after="40"/>
-            </w:pPr>
-            <w:r>
-              <w:rPr>
-                <w:rFonts w:ascii="Arial" w:cs="Arial" w:eastAsia="Arial" w:hAnsi="Arial"/>
-                <w:sz w:val="19"/>
-                <w:szCs w:val="19"/>
-              </w:rPr>
-              <w:t xml:space="preserve">Open pna_uv.png and identify the dominant absorption band.</w:t>
-            </w:r>
-          </w:p>
-          <w:p>
-            <w:pPr>
-              <w:spacing w:after="40"/>
-            </w:pPr>
-            <w:r>
-              <w:rPr>
-                <w:rFonts w:ascii="Arial" w:cs="Arial" w:eastAsia="Arial" w:hAnsi="Arial"/>
-                <w:sz w:val="19"/>
-                <w:szCs w:val="19"/>
-              </w:rPr>
-              <w:t xml:space="preserve">Record its wavelength. The experimental absorption maximum for PNA in water is</w:t>
-            </w:r>
-          </w:p>
-          <w:p>
-            <w:pPr>
-              <w:spacing w:after="40"/>
-            </w:pPr>
-            <w:r>
-              <w:rPr>
-                <w:rFonts w:ascii="Arial" w:cs="Arial" w:eastAsia="Arial" w:hAnsi="Arial"/>
-                <w:sz w:val="19"/>
-                <w:szCs w:val="19"/>
-              </w:rPr>
-              <w:t xml:space="preserve">approximately 370 nm. How close is your computed value?</w:t>
-            </w:r>
-          </w:p>
-          <w:p>
-            <w:pPr>
-              <w:spacing w:after="40"/>
-            </w:pPr>
-            <w:r>
-              <w:rPr>
-                <w:rFonts w:ascii="Arial" w:cs="Arial" w:eastAsia="Arial" w:hAnsi="Arial"/>
-                <w:sz w:val="19"/>
-                <w:szCs w:val="19"/>
-              </w:rPr>
-              <w:t xml:space="preserve">Also note any secondary bands at shorter wavelengths.</w:t>
-            </w:r>
-          </w:p>
-        </w:tc>
-      </w:tr>
-    </w:tbl>
-    <w:p>
-      <w:pPr>
-        <w:pStyle w:val="Heading1"/>
-        <w:spacing w:before="360" w:after="160"/>
-      </w:pPr>
-      <w:r>
-        <w:rPr>
-          <w:rFonts w:ascii="Arial" w:cs="Arial" w:eastAsia="Arial" w:hAnsi="Arial"/>
-          <w:b/>
-          <w:bCs/>
-          <w:sz w:val="28"/>
-          <w:szCs w:val="28"/>
-        </w:rPr>
-        <w:t xml:space="preserve">Part 3: Functional and Basis Set Benchmarking</w:t>
-      </w:r>
-    </w:p>
-    <w:p>
-      <w:pPr>
-        <w:spacing w:after="120"/>
-      </w:pPr>
-      <w:r>
-        <w:rPr>
-          <w:rFonts w:ascii="Arial" w:cs="Arial" w:eastAsia="Arial" w:hAnsi="Arial"/>
-          <w:sz w:val="20"/>
-          <w:szCs w:val="20"/>
-        </w:rPr>
-        <w:t xml:space="preserve">Now that you have a baseline spectrum, the real learning begins. You will systematically vary the density functional and basis set in the TDDFT step (Stage 5) while keeping everything else constant, then compare how each choice affects the predicted absorption maximum. This exercise mirrors the kind of benchmarking study you would perform before using TDDFT predictions in a research context.</w:t>
-      </w:r>
-    </w:p>
-    <w:p>
-      <w:pPr>
-        <w:pStyle w:val="Heading2"/>
-        <w:spacing w:before="280" w:after="120"/>
-      </w:pPr>
-      <w:r>
-        <w:rPr>
-          <w:rFonts w:ascii="Arial" w:cs="Arial" w:eastAsia="Arial" w:hAnsi="Arial"/>
-          <w:b/>
-          <w:bCs/>
-          <w:sz w:val="24"/>
-          <w:szCs w:val="24"/>
-        </w:rPr>
-        <w:t xml:space="preserve">Exercise 3.1: Functional Comparison</w:t>
-      </w:r>
-    </w:p>
-    <w:p>
-      <w:pPr>
-        <w:spacing w:after="120"/>
-      </w:pPr>
-      <w:r>
-        <w:rPr>
-          <w:rFonts w:ascii="Arial" w:cs="Arial" w:eastAsia="Arial" w:hAnsi="Arial"/>
-          <w:sz w:val="20"/>
-          <w:szCs w:val="20"/>
-        </w:rPr>
-        <w:t xml:space="preserve">Re-run Stage 5 (and then Stages 6-8) with each of the following functionals, keeping the basis set at def2-TZVP and the solvent as CPCM(WATER). To avoid overwriting your baseline results, create a separate working directory for each functional or rename the output directories between runs.</w:t>
+        <w:t xml:space="preserve">Re-run Stage 5 (and then re-plot) with each of the following functionals, keeping the basis set at def2-TZVP and the solvent as CPCM(WATER). To avoid overwriting your baseline results, create a separate working directory for each functional or rename the output directories between runs.</w:t>
       </w:r>
     </w:p>
     <w:p>
@@ -4282,7 +4087,7 @@
           <w:sz w:val="20"/>
           <w:szCs w:val="20"/>
         </w:rPr>
-        <w:t xml:space="preserve">If time allows, re-run the complete workflow (Stages 3-8) using a different solvent to observe the solvatochromic shift of the PNA absorption band. For example, re-optimize and compute the spectrum in cyclohexane (a nonpolar solvent):</w:t>
+        <w:t xml:space="preserve">If time allows, re-run the complete workflow (Stages 3-5 and plotting) using a different solvent to observe the solvatochromic shift of the PNA absorption band. For example, re-optimize and compute the spectrum in cyclohexane (a nonpolar solvent):</w:t>
       </w:r>
     </w:p>
     <w:tbl>
@@ -4380,7 +4185,7 @@
                 <w:sz w:val="17"/>
                 <w:szCs w:val="17"/>
               </w:rPr>
-              <w:t xml:space="preserve"># Then re-run Stages 4-8 with the same solvent for TDDFT</w:t>
+              <w:t xml:space="preserve"># Then re-run Stages 4-5 and re-plot with the same solvent</w:t>
             </w:r>
           </w:p>
           <w:p>
@@ -4799,32 +4604,6 @@
                 <w:szCs w:val="19"/>
               </w:rPr>
               <w:t xml:space="preserve">Stage 6: ./6-orca-ecd.sh [--method --basis --disp --solvent --roots --cpus] molecules.txt</w:t>
-            </w:r>
-          </w:p>
-          <w:p>
-            <w:pPr>
-              <w:spacing w:after="40"/>
-            </w:pPr>
-            <w:r>
-              <w:rPr>
-                <w:rFonts w:ascii="Arial" w:cs="Arial" w:eastAsia="Arial" w:hAnsi="Arial"/>
-                <w:sz w:val="19"/>
-                <w:szCs w:val="19"/>
-              </w:rPr>
-              <w:t xml:space="preserve">Plot:  </w:t>
-            </w:r>
-          </w:p>
-          <w:p>
-            <w:pPr>
-              <w:spacing w:after="40"/>
-            </w:pPr>
-            <w:r>
-              <w:rPr>
-                <w:rFonts w:ascii="Arial" w:cs="Arial" w:eastAsia="Arial" w:hAnsi="Arial"/>
-                <w:sz w:val="19"/>
-                <w:szCs w:val="19"/>
-              </w:rPr>
-              <w:t xml:space="preserve">Plot:  </w:t>
             </w:r>
           </w:p>
           <w:p>

</xml_diff>

<commit_message>
Added --tittle flag. Modifed handouts
</commit_message>
<xml_diff>
--- a/Session1_UVVis_Benchmarking_Handout.docx
+++ b/Session1_UVVis_Benchmarking_Handout.docx
@@ -61,21 +61,6 @@
     </w:p>
     <w:p>
       <w:pPr>
-        <w:spacing w:after="80"/>
-        <w:jc w:val="center"/>
-      </w:pPr>
-      <w:r>
-        <w:rPr>
-          <w:rFonts w:ascii="Arial" w:cs="Arial" w:eastAsia="Arial" w:hAnsi="Arial"/>
-          <w:color w:val="666666"/>
-          <w:sz w:val="20"/>
-          <w:szCs w:val="20"/>
-        </w:rPr>
-        <w:t xml:space="preserve">Department of Chemistry, University of South Florida</w:t>
-      </w:r>
-    </w:p>
-    <w:p>
-      <w:pPr>
         <w:spacing w:after="400"/>
         <w:jc w:val="center"/>
       </w:pPr>
@@ -121,7 +106,7 @@
           <w:sz w:val="20"/>
           <w:szCs w:val="20"/>
         </w:rPr>
-        <w:t xml:space="preserve">In this session you will use time-dependent density functional theory (TDDFT) to compute the UV-Vis absorption spectrum of para-nitroaniline (PNA), a small aromatic molecule with a well-characterized intramolecular charge-transfer (ICT) absorption band. PNA is one of the most heavily benchmarked molecules in the TDDFT literature, making it an ideal test case for learning how methodological choices affect computed excitation energies and intensities.</w:t>
+        <w:t xml:space="preserve">In this session you will use time-dependent density functional theory (TDDFT) to compute the UV-Vis absorption spectrum of para-nitroaniline (PNA), a small aromatic molecule with a well-characterized intramolecular charge-transfer (ICT) absorption band. PNA is one of the most heavily benchmarked molecules in the TDDFT literature (Laurent &amp; Jacquemin, 2013), making it an ideal test case for learning how methodological choices affect computed excitation energies and intensities.</w:t>
       </w:r>
     </w:p>
     <w:p>
@@ -824,7 +809,7 @@
           <w:sz w:val="20"/>
           <w:szCs w:val="20"/>
         </w:rPr>
-        <w:t xml:space="preserve">The workflow scripts all accept a plain-text molecule list as their final argument. Each line contains one molecule name (matching the filename in pre_xyz/ without the .xyz extension). Lines starting with # are ignored.</w:t>
+        <w:t xml:space="preserve">The workflow scripts all accept a plain-text molecule list as their final argument. Each line contains one molecule name (matching the base of the XYZ filename in pre_xyz/ without the .xyz extension). Lines starting with # are ignored. Alternatively, you may pass the molecule name directly on the command line in place of the list file; for example, passing pna instead of molecules.txt will process pre_xyz/pna.xyz.</w:t>
       </w:r>
     </w:p>
     <w:tbl>
@@ -1834,7 +1819,7 @@
           <w:sz w:val="20"/>
           <w:szCs w:val="20"/>
         </w:rPr>
-        <w:t xml:space="preserve">The Boltzmann filter reads the final energies from each solvent-phase optimization, computes the population of each conformer at a given temperature, and keeps only those conformers whose population exceeds a threshold. For PNA with its single conformer, this step is trivial but still executes correctly.</w:t>
+        <w:t xml:space="preserve">The Boltzmann filter reads the final energies from each solvent-phase optimization, computes the population of each conformer at a given temperature, and keeps only those conformers whose population exceeds a threshold. For PNA and its expected single conformer, this step is trivial but still executes correctly.</w:t>
       </w:r>
     </w:p>
     <w:tbl>
@@ -2434,7 +2419,7 @@
                 <w:sz w:val="17"/>
                 <w:szCs w:val="17"/>
               </w:rPr>
-              <w:t xml:space="preserve">python3 or_ecd_uvvis_tools.py pna/05_ecd/**/*.log --bw pna/04_boltzmann/pna_energies.dat --outdir pna --stick --xlim 200 500</w:t>
+              <w:t xml:space="preserve">python3 or_ecd_uvvis_tools.py pna/05_ecd/**/*.log --bw pna/04_boltzmann/pna_energies.dat --outdir pna --stick --flip_x --xlim 200 500</w:t>
             </w:r>
           </w:p>
         </w:tc>
@@ -2608,7 +2593,7 @@
           <w:sz w:val="20"/>
           <w:szCs w:val="20"/>
         </w:rPr>
-        <w:t xml:space="preserve">Now that you have a baseline spectrum, the real learning begins. You will systematically vary the density functional and basis set in the TDDFT step (Stage 5) while keeping everything else constant, then compare how each choice affects the predicted absorption maximum. This exercise mirrors the kind of benchmarking study you would perform before using TDDFT predictions in a research context.</w:t>
+        <w:t xml:space="preserve">Now that you have a baseline spectrum, the real learning begins. You will systematically vary the density functional and then the basis sets in the TDDFT step (Stage 5) while keeping everything else constant, then compare how each choice affects the predicted absorption maximum. This exercise mirrors the kind of benchmarking study you would perform before using TDDFT predictions in a research context.</w:t>
       </w:r>
     </w:p>
     <w:p>
@@ -2650,7 +2635,7 @@
           <w:sz w:val="20"/>
           <w:szCs w:val="20"/>
         </w:rPr>
-        <w:t xml:space="preserve">One efficient approach is to create a copy of the working directory for each run:</w:t>
+        <w:t xml:space="preserve">The recommended approach is to rename the output directory after each run, then re-run Stage 6, which will create a fresh pna/05_ecd directory. This leaves all prior stage outputs untouched:</w:t>
       </w:r>
     </w:p>
     <w:tbl>
@@ -2696,59 +2681,59 @@
                 <w:sz w:val="17"/>
                 <w:szCs w:val="17"/>
               </w:rPr>
-              <w:t xml:space="preserve"># Example: set up a B3LYP TDDFT run</w:t>
-            </w:r>
-          </w:p>
-          <w:p>
-            <w:pPr>
-              <w:spacing w:after="20"/>
-            </w:pPr>
-            <w:r>
-              <w:rPr>
-                <w:rFonts w:ascii="Courier New" w:cs="Courier New" w:eastAsia="Courier New" w:hAnsi="Courier New"/>
-                <w:sz w:val="17"/>
-                <w:szCs w:val="17"/>
-              </w:rPr>
-              <w:t xml:space="preserve">cp -r pna/04_boltzmann pna_b3lyp_tddft/04_boltzmann</w:t>
-            </w:r>
-          </w:p>
-          <w:p>
-            <w:pPr>
-              <w:spacing w:after="20"/>
-            </w:pPr>
-            <w:r>
-              <w:rPr>
-                <w:rFonts w:ascii="Courier New" w:cs="Courier New" w:eastAsia="Courier New" w:hAnsi="Courier New"/>
-                <w:sz w:val="17"/>
-                <w:szCs w:val="17"/>
-              </w:rPr>
-              <w:t xml:space="preserve">cp -r pna/03_solvent_opt pna_b3lyp_tddft/03_solvent_opt</w:t>
-            </w:r>
-          </w:p>
-          <w:p>
-            <w:pPr>
-              <w:spacing w:after="20"/>
-            </w:pPr>
-            <w:r>
-              <w:rPr>
-                <w:rFonts w:ascii="Courier New" w:cs="Courier New" w:eastAsia="Courier New" w:hAnsi="Courier New"/>
-                <w:sz w:val="17"/>
-                <w:szCs w:val="17"/>
-              </w:rPr>
-              <w:t xml:space="preserve"># Then modify molecules.txt to point to pna_b3lyp_tddft</w:t>
-            </w:r>
-          </w:p>
-          <w:p>
-            <w:pPr>
-              <w:spacing w:after="20"/>
-            </w:pPr>
-            <w:r>
-              <w:rPr>
-                <w:rFonts w:ascii="Courier New" w:cs="Courier New" w:eastAsia="Courier New" w:hAnsi="Courier New"/>
-                <w:sz w:val="17"/>
-                <w:szCs w:val="17"/>
-              </w:rPr>
-              <w:t xml:space="preserve"># Or rename directories as needed before re-running Stages 6 and plotting</w:t>
+              <w:t xml:space="preserve"># After running Stage 6 with your baseline (wB97X-D3), rename the output:</w:t>
+            </w:r>
+          </w:p>
+          <w:p>
+            <w:pPr>
+              <w:spacing w:after="20"/>
+            </w:pPr>
+            <w:r>
+              <w:rPr>
+                <w:rFonts w:ascii="Courier New" w:cs="Courier New" w:eastAsia="Courier New" w:hAnsi="Courier New"/>
+                <w:sz w:val="17"/>
+                <w:szCs w:val="17"/>
+              </w:rPr>
+              <w:t xml:space="preserve">mv pna/05_ecd pna/05_ecd_wb97xd3</w:t>
+            </w:r>
+          </w:p>
+          <w:p>
+            <w:pPr>
+              <w:spacing w:after="20"/>
+            </w:pPr>
+            <w:r>
+              <w:rPr>
+                <w:rFonts w:ascii="Courier New" w:cs="Courier New" w:eastAsia="Courier New" w:hAnsi="Courier New"/>
+                <w:sz w:val="17"/>
+                <w:szCs w:val="17"/>
+              </w:rPr>
+              <w:t xml:space="preserve"># Re-run Stage 6 with B3LYP; a new pna/05_ecd will be created</w:t>
+            </w:r>
+          </w:p>
+          <w:p>
+            <w:pPr>
+              <w:spacing w:after="20"/>
+            </w:pPr>
+            <w:r>
+              <w:rPr>
+                <w:rFonts w:ascii="Courier New" w:cs="Courier New" w:eastAsia="Courier New" w:hAnsi="Courier New"/>
+                <w:sz w:val="17"/>
+                <w:szCs w:val="17"/>
+              </w:rPr>
+              <w:t xml:space="preserve">mv pna/05_ecd pna/05_ecd_b3lyp</w:t>
+            </w:r>
+          </w:p>
+          <w:p>
+            <w:pPr>
+              <w:spacing w:after="20"/>
+            </w:pPr>
+            <w:r>
+              <w:rPr>
+                <w:rFonts w:ascii="Courier New" w:cs="Courier New" w:eastAsia="Courier New" w:hAnsi="Courier New"/>
+                <w:sz w:val="17"/>
+                <w:szCs w:val="17"/>
+              </w:rPr>
+              <w:t xml:space="preserve"># Repeat for each additional functional</w:t>
             </w:r>
           </w:p>
         </w:tc>
@@ -4296,130 +4281,6 @@
     </w:p>
     <w:p>
       <w:pPr>
-        <w:pStyle w:val="Heading1"/>
-        <w:spacing w:before="360" w:after="160"/>
-      </w:pPr>
-      <w:r>
-        <w:rPr>
-          <w:rFonts w:ascii="Arial" w:cs="Arial" w:eastAsia="Arial" w:hAnsi="Arial"/>
-          <w:b/>
-          <w:bCs/>
-          <w:sz w:val="28"/>
-          <w:szCs w:val="28"/>
-        </w:rPr>
-        <w:t xml:space="preserve">Part 4: Summary and Report Preparation</w:t>
-      </w:r>
-    </w:p>
-    <w:p>
-      <w:pPr>
-        <w:spacing w:after="120"/>
-      </w:pPr>
-      <w:r>
-        <w:rPr>
-          <w:rFonts w:ascii="Arial" w:cs="Arial" w:eastAsia="Arial" w:hAnsi="Arial"/>
-          <w:sz w:val="20"/>
-          <w:szCs w:val="20"/>
-        </w:rPr>
-        <w:t xml:space="preserve">Compile your results into a short report (2-3 pages) that includes the following elements:</w:t>
-      </w:r>
-    </w:p>
-    <w:p>
-      <w:pPr>
-        <w:pStyle w:val="ListParagraph"/>
-        <w:numPr>
-          <w:ilvl w:val="0"/>
-          <w:numId w:val="3"/>
-        </w:numPr>
-        <w:spacing w:after="80"/>
-      </w:pPr>
-      <w:r>
-        <w:rPr>
-          <w:rFonts w:ascii="Arial" w:cs="Arial" w:eastAsia="Arial" w:hAnsi="Arial"/>
-          <w:sz w:val="20"/>
-          <w:szCs w:val="20"/>
-        </w:rPr>
-        <w:t xml:space="preserve">A brief description of the molecule and the computational workflow you used.</w:t>
-      </w:r>
-    </w:p>
-    <w:p>
-      <w:pPr>
-        <w:pStyle w:val="ListParagraph"/>
-        <w:numPr>
-          <w:ilvl w:val="0"/>
-          <w:numId w:val="3"/>
-        </w:numPr>
-        <w:spacing w:after="80"/>
-      </w:pPr>
-      <w:r>
-        <w:rPr>
-          <w:rFonts w:ascii="Arial" w:cs="Arial" w:eastAsia="Arial" w:hAnsi="Arial"/>
-          <w:sz w:val="20"/>
-          <w:szCs w:val="20"/>
-        </w:rPr>
-        <w:t xml:space="preserve">Your functional benchmarking table (from Exercise 3.1) with a discussion of the trends you observed.</w:t>
-      </w:r>
-    </w:p>
-    <w:p>
-      <w:pPr>
-        <w:pStyle w:val="ListParagraph"/>
-        <w:numPr>
-          <w:ilvl w:val="0"/>
-          <w:numId w:val="3"/>
-        </w:numPr>
-        <w:spacing w:after="80"/>
-      </w:pPr>
-      <w:r>
-        <w:rPr>
-          <w:rFonts w:ascii="Arial" w:cs="Arial" w:eastAsia="Arial" w:hAnsi="Arial"/>
-          <w:sz w:val="20"/>
-          <w:szCs w:val="20"/>
-        </w:rPr>
-        <w:t xml:space="preserve">Your basis set convergence results (from Exercise 3.2).</w:t>
-      </w:r>
-    </w:p>
-    <w:p>
-      <w:pPr>
-        <w:pStyle w:val="ListParagraph"/>
-        <w:numPr>
-          <w:ilvl w:val="0"/>
-          <w:numId w:val="3"/>
-        </w:numPr>
-        <w:spacing w:after="80"/>
-      </w:pPr>
-      <w:r>
-        <w:rPr>
-          <w:rFonts w:ascii="Arial" w:cs="Arial" w:eastAsia="Arial" w:hAnsi="Arial"/>
-          <w:sz w:val="20"/>
-          <w:szCs w:val="20"/>
-        </w:rPr>
-        <w:t xml:space="preserve">At least one figure showing your computed UV-Vis spectrum overlaid with or compared to the experimental reference.</w:t>
-      </w:r>
-    </w:p>
-    <w:p>
-      <w:pPr>
-        <w:pStyle w:val="ListParagraph"/>
-        <w:numPr>
-          <w:ilvl w:val="0"/>
-          <w:numId w:val="3"/>
-        </w:numPr>
-        <w:spacing w:after="80"/>
-      </w:pPr>
-      <w:r>
-        <w:rPr>
-          <w:rFonts w:ascii="Arial" w:cs="Arial" w:eastAsia="Arial" w:hAnsi="Arial"/>
-          <w:sz w:val="20"/>
-          <w:szCs w:val="20"/>
-        </w:rPr>
-        <w:t xml:space="preserve">A justified recommendation for the best functional/basis set combination for this system, supported by your data and by reference to at least one benchmarking paper.</w:t>
-      </w:r>
-    </w:p>
-    <w:p>
-      <w:pPr>
-        <w:spacing w:after="120"/>
-      </w:pPr>
-    </w:p>
-    <w:p>
-      <w:pPr>
         <w:pStyle w:val="Heading2"/>
         <w:spacing w:before="280" w:after="120"/>
       </w:pPr>
@@ -4431,67 +4292,34 @@
           <w:sz w:val="24"/>
           <w:szCs w:val="24"/>
         </w:rPr>
-        <w:t xml:space="preserve">Key References</w:t>
-      </w:r>
-    </w:p>
-    <w:p>
-      <w:pPr>
-        <w:pStyle w:val="ListParagraph"/>
-        <w:numPr>
-          <w:ilvl w:val="0"/>
-          <w:numId w:val="2"/>
-        </w:numPr>
-        <w:spacing w:after="60"/>
-      </w:pPr>
-      <w:r>
-        <w:rPr>
-          <w:rFonts w:ascii="Arial" w:cs="Arial" w:eastAsia="Arial" w:hAnsi="Arial"/>
-          <w:sz w:val="19"/>
-          <w:szCs w:val="19"/>
-        </w:rPr>
-        <w:t xml:space="preserve">Laurent, A. D.; Jacquemin, D. TD-DFT Benchmarks: A Review. Int. J. Quantum Chem. 2013, 113, 2019-2039.</w:t>
-      </w:r>
-    </w:p>
-    <w:p>
-      <w:pPr>
-        <w:pStyle w:val="ListParagraph"/>
-        <w:numPr>
-          <w:ilvl w:val="0"/>
-          <w:numId w:val="2"/>
-        </w:numPr>
-        <w:spacing w:after="60"/>
-      </w:pPr>
-      <w:r>
-        <w:rPr>
-          <w:rFonts w:ascii="Arial" w:cs="Arial" w:eastAsia="Arial" w:hAnsi="Arial"/>
-          <w:sz w:val="19"/>
-          <w:szCs w:val="19"/>
-        </w:rPr>
-        <w:t xml:space="preserve">Bursch, M.; Mewes, J.-M.; Hansen, A.; Grimme, S. Best-Practice DFT Protocols for Basic Molecular Computational Chemistry. Angew. Chem. Int. Ed. 2023, 62, e202205735.</w:t>
-      </w:r>
-    </w:p>
-    <w:p>
-      <w:pPr>
-        <w:pStyle w:val="ListParagraph"/>
-        <w:numPr>
-          <w:ilvl w:val="0"/>
-          <w:numId w:val="2"/>
-        </w:numPr>
-        <w:spacing w:after="60"/>
-      </w:pPr>
-      <w:r>
-        <w:rPr>
-          <w:rFonts w:ascii="Arial" w:cs="Arial" w:eastAsia="Arial" w:hAnsi="Arial"/>
-          <w:sz w:val="19"/>
-          <w:szCs w:val="19"/>
-        </w:rPr>
-        <w:t xml:space="preserve">Guido, C. A.; Jacquemin, D.; Adamo, C.; Mennucci, B. Electronic Excitations in Solution. J. Chem. Theory Comput. 2015, 11, 5782-5790.</w:t>
-      </w:r>
-    </w:p>
-    <w:p>
-      <w:pPr>
-        <w:spacing w:after="200"/>
-      </w:pPr>
+        <w:t xml:space="preserve">Exercise 3.4: Solvent Model Comparison (Optional, time permitting)</w:t>
+      </w:r>
+    </w:p>
+    <w:p>
+      <w:pPr>
+        <w:spacing w:after="120"/>
+      </w:pPr>
+      <w:r>
+        <w:rPr>
+          <w:rFonts w:ascii="Arial" w:cs="Arial" w:eastAsia="Arial" w:hAnsi="Arial"/>
+          <w:sz w:val="20"/>
+          <w:szCs w:val="20"/>
+        </w:rPr>
+        <w:t xml:space="preserve">The earlier runs used CPCM for implicit solvation, which captures the bulk electrostatic response of the solvent. SMD adds short-range non-electrostatic terms (cavitation, dispersion, and solvent structure) that can improve accuracy in polar, hydrogen-bonding solvents. In this exercise you will repeat the B3LYP and CAM-B3LYP TDDFT calculations using SMD in place of CPCM and compare the effect on the predicted absorption maximum. Because SMD modifies both the geometry and the electronic structure, Stage 3 must be re-run before Stage 6.</w:t>
+      </w:r>
+    </w:p>
+    <w:p>
+      <w:pPr>
+        <w:spacing w:after="120"/>
+      </w:pPr>
+      <w:r>
+        <w:rPr>
+          <w:rFonts w:ascii="Arial" w:cs="Arial" w:eastAsia="Arial" w:hAnsi="Arial"/>
+          <w:sz w:val="20"/>
+          <w:szCs w:val="20"/>
+        </w:rPr>
+        <w:t xml:space="preserve">Re-run Stage 3 with SMD, then re-run Stage 4 (Boltzmann weighting), and finally re-run Stage 6 twice—once for B3LYP and once for CAM-B3LYP. Use the mv approach from Exercise 3.1 to preserve each result.</w:t>
+      </w:r>
     </w:p>
     <w:tbl>
       <w:tblPr>
@@ -4518,7 +4346,7 @@
               <w:bottom w:val="single" w:color="AAAAAA" w:sz="1"/>
               <w:right w:val="single" w:color="AAAAAA" w:sz="1"/>
             </w:tcBorders>
-            <w:shd w:fill="FFF3CD" w:val="clear"/>
+            <w:shd w:fill="F2F2F2" w:val="clear"/>
             <w:tcMar>
               <w:top w:type="dxa" w:w="80"/>
               <w:left w:type="dxa" w:w="160"/>
@@ -4528,7 +4356,225 @@
           </w:tcPr>
           <w:p>
             <w:pPr>
-              <w:spacing w:after="60"/>
+              <w:spacing w:after="20"/>
+            </w:pPr>
+            <w:r>
+              <w:rPr>
+                <w:rFonts w:ascii="Courier New" w:cs="Courier New" w:eastAsia="Courier New" w:hAnsi="Courier New"/>
+                <w:sz w:val="17"/>
+                <w:szCs w:val="17"/>
+              </w:rPr>
+              <w:t xml:space="preserve"># Re-run Stage 3 with SMD</w:t>
+            </w:r>
+          </w:p>
+          <w:p>
+            <w:pPr>
+              <w:spacing w:after="20"/>
+            </w:pPr>
+            <w:r>
+              <w:rPr>
+                <w:rFonts w:ascii="Courier New" w:cs="Courier New" w:eastAsia="Courier New" w:hAnsi="Courier New"/>
+                <w:sz w:val="17"/>
+                <w:szCs w:val="17"/>
+              </w:rPr>
+              <w:t xml:space="preserve">./4-orca-solvent-opt.sh --method B3LYP --disp D3BJ --basis def2-SVP \</w:t>
+            </w:r>
+          </w:p>
+          <w:p>
+            <w:pPr>
+              <w:spacing w:after="20"/>
+            </w:pPr>
+            <w:r>
+              <w:rPr>
+                <w:rFonts w:ascii="Courier New" w:cs="Courier New" w:eastAsia="Courier New" w:hAnsi="Courier New"/>
+                <w:sz w:val="17"/>
+                <w:szCs w:val="17"/>
+              </w:rPr>
+              <w:t xml:space="preserve">    --solvent water --solvent-model smd --cpus 4 molecules.txt</w:t>
+            </w:r>
+          </w:p>
+          <w:p>
+            <w:pPr>
+              <w:spacing w:after="20"/>
+            </w:pPr>
+            <w:r>
+              <w:rPr>
+                <w:rFonts w:ascii="Courier New" w:cs="Courier New" w:eastAsia="Courier New" w:hAnsi="Courier New"/>
+                <w:sz w:val="17"/>
+                <w:szCs w:val="17"/>
+              </w:rPr>
+              <w:t xml:space="preserve"># Re-run Stage 4 (Boltzmann weighting)</w:t>
+            </w:r>
+          </w:p>
+          <w:p>
+            <w:pPr>
+              <w:spacing w:after="20"/>
+            </w:pPr>
+            <w:r>
+              <w:rPr>
+                <w:rFonts w:ascii="Courier New" w:cs="Courier New" w:eastAsia="Courier New" w:hAnsi="Courier New"/>
+                <w:sz w:val="17"/>
+                <w:szCs w:val="17"/>
+              </w:rPr>
+              <w:t xml:space="preserve">./5-orca-boltzmann-weight.sh --temp 298.15 --p-cut 0.01 molecules.txt</w:t>
+            </w:r>
+          </w:p>
+          <w:p>
+            <w:pPr>
+              <w:spacing w:after="20"/>
+            </w:pPr>
+            <w:r>
+              <w:rPr>
+                <w:rFonts w:ascii="Courier New" w:cs="Courier New" w:eastAsia="Courier New" w:hAnsi="Courier New"/>
+                <w:sz w:val="17"/>
+                <w:szCs w:val="17"/>
+              </w:rPr>
+              <w:t xml:space="preserve"># Run Stage 6 with B3LYP/SMD, then rename</w:t>
+            </w:r>
+          </w:p>
+          <w:p>
+            <w:pPr>
+              <w:spacing w:after="20"/>
+            </w:pPr>
+            <w:r>
+              <w:rPr>
+                <w:rFonts w:ascii="Courier New" w:cs="Courier New" w:eastAsia="Courier New" w:hAnsi="Courier New"/>
+                <w:sz w:val="17"/>
+                <w:szCs w:val="17"/>
+              </w:rPr>
+              <w:t xml:space="preserve">./6-orca-ecd.sh --method B3LYP --basis def2-TZVP \</w:t>
+            </w:r>
+          </w:p>
+          <w:p>
+            <w:pPr>
+              <w:spacing w:after="20"/>
+            </w:pPr>
+            <w:r>
+              <w:rPr>
+                <w:rFonts w:ascii="Courier New" w:cs="Courier New" w:eastAsia="Courier New" w:hAnsi="Courier New"/>
+                <w:sz w:val="17"/>
+                <w:szCs w:val="17"/>
+              </w:rPr>
+              <w:t xml:space="preserve">    --solvent water --solvent-model smd --roots 20 --cpus 4 molecules.txt</w:t>
+            </w:r>
+          </w:p>
+          <w:p>
+            <w:pPr>
+              <w:spacing w:after="20"/>
+            </w:pPr>
+            <w:r>
+              <w:rPr>
+                <w:rFonts w:ascii="Courier New" w:cs="Courier New" w:eastAsia="Courier New" w:hAnsi="Courier New"/>
+                <w:sz w:val="17"/>
+                <w:szCs w:val="17"/>
+              </w:rPr>
+              <w:t xml:space="preserve">mv pna/05_ecd pna/05_ecd_b3lyp_smd</w:t>
+            </w:r>
+          </w:p>
+          <w:p>
+            <w:pPr>
+              <w:spacing w:after="20"/>
+            </w:pPr>
+            <w:r>
+              <w:rPr>
+                <w:rFonts w:ascii="Courier New" w:cs="Courier New" w:eastAsia="Courier New" w:hAnsi="Courier New"/>
+                <w:sz w:val="17"/>
+                <w:szCs w:val="17"/>
+              </w:rPr>
+              <w:t xml:space="preserve"># Run Stage 6 with CAM-B3LYP/SMD, then rename</w:t>
+            </w:r>
+          </w:p>
+          <w:p>
+            <w:pPr>
+              <w:spacing w:after="20"/>
+            </w:pPr>
+            <w:r>
+              <w:rPr>
+                <w:rFonts w:ascii="Courier New" w:cs="Courier New" w:eastAsia="Courier New" w:hAnsi="Courier New"/>
+                <w:sz w:val="17"/>
+                <w:szCs w:val="17"/>
+              </w:rPr>
+              <w:t xml:space="preserve">./6-orca-ecd.sh --method CAM-B3LYP --basis def2-TZVP \</w:t>
+            </w:r>
+          </w:p>
+          <w:p>
+            <w:pPr>
+              <w:spacing w:after="20"/>
+            </w:pPr>
+            <w:r>
+              <w:rPr>
+                <w:rFonts w:ascii="Courier New" w:cs="Courier New" w:eastAsia="Courier New" w:hAnsi="Courier New"/>
+                <w:sz w:val="17"/>
+                <w:szCs w:val="17"/>
+              </w:rPr>
+              <w:t xml:space="preserve">    --solvent water --solvent-model smd --roots 20 --cpus 4 molecules.txt</w:t>
+            </w:r>
+          </w:p>
+          <w:p>
+            <w:pPr>
+              <w:spacing w:after="20"/>
+            </w:pPr>
+            <w:r>
+              <w:rPr>
+                <w:rFonts w:ascii="Courier New" w:cs="Courier New" w:eastAsia="Courier New" w:hAnsi="Courier New"/>
+                <w:sz w:val="17"/>
+                <w:szCs w:val="17"/>
+              </w:rPr>
+              <w:t xml:space="preserve">mv pna/05_ecd pna/05_ecd_camb3lyp_smd</w:t>
+            </w:r>
+          </w:p>
+        </w:tc>
+      </w:tr>
+    </w:tbl>
+    <w:p>
+      <w:pPr>
+        <w:spacing w:after="120"/>
+      </w:pPr>
+      <w:r>
+        <w:rPr>
+          <w:rFonts w:ascii="Arial" w:cs="Arial" w:eastAsia="Arial" w:hAnsi="Arial"/>
+          <w:sz w:val="20"/>
+          <w:szCs w:val="20"/>
+        </w:rPr>
+        <w:t xml:space="preserve">Compare your SMD results with the CPCM results from Exercise 3.1 and record the shift in λmax for each functional.</w:t>
+      </w:r>
+    </w:p>
+    <w:tbl>
+      <w:tblPr>
+        <w:tblW w:type="dxa" w:w="9360"/>
+        <w:tblBorders>
+          <w:top w:val="single" w:color="auto" w:sz="4"/>
+          <w:left w:val="single" w:color="auto" w:sz="4"/>
+          <w:bottom w:val="single" w:color="auto" w:sz="4"/>
+          <w:right w:val="single" w:color="auto" w:sz="4"/>
+          <w:insideH w:val="single" w:color="auto" w:sz="4"/>
+          <w:insideV w:val="single" w:color="auto" w:sz="4"/>
+        </w:tblBorders>
+      </w:tblPr>
+      <w:tblGrid>
+        <w:gridCol w:w="9360"/>
+      </w:tblGrid>
+      <w:tr>
+        <w:tc>
+          <w:tcPr>
+            <w:tcW w:type="dxa" w:w="9360"/>
+            <w:tcBorders>
+              <w:top w:val="single" w:color="AAAAAA" w:sz="1"/>
+              <w:left w:val="single" w:color="AAAAAA" w:sz="1"/>
+              <w:bottom w:val="single" w:color="AAAAAA" w:sz="1"/>
+              <w:right w:val="single" w:color="AAAAAA" w:sz="1"/>
+            </w:tcBorders>
+            <w:shd w:fill="E8DAEF" w:val="clear"/>
+            <w:tcMar>
+              <w:top w:type="dxa" w:w="80"/>
+              <w:left w:type="dxa" w:w="160"/>
+              <w:bottom w:type="dxa" w:w="80"/>
+              <w:right w:type="dxa" w:w="160"/>
+            </w:tcMar>
+          </w:tcPr>
+          <w:p>
+            <w:pPr>
+              <w:spacing w:after="40"/>
             </w:pPr>
             <w:r>
               <w:rPr>
@@ -4538,6 +4584,269 @@
                 <w:sz w:val="20"/>
                 <w:szCs w:val="20"/>
               </w:rPr>
+              <w:t xml:space="preserve">Discussion Question 7: </w:t>
+            </w:r>
+            <w:r>
+              <w:rPr>
+                <w:rFonts w:ascii="Arial" w:cs="Arial" w:eastAsia="Arial" w:hAnsi="Arial"/>
+                <w:sz w:val="20"/>
+                <w:szCs w:val="20"/>
+              </w:rPr>
+              <w:t xml:space="preserve">Does switching from CPCM to SMD produce a meaningful change in the predicted absorption maximum for B3LYP and CAM-B3LYP? Is the effect larger for the functional that underestimates the CT excitation energy (B3LYP) or for the one that performs better (CAM-B3LYP)? What physical differences between CPCM and SMD might explain your observations?</w:t>
+            </w:r>
+          </w:p>
+        </w:tc>
+      </w:tr>
+    </w:tbl>
+    <w:p>
+      <w:pPr>
+        <w:spacing w:after="80"/>
+      </w:pPr>
+    </w:p>
+    <w:p>
+      <w:pPr>
+        <w:pStyle w:val="Heading1"/>
+        <w:spacing w:before="360" w:after="160"/>
+      </w:pPr>
+      <w:r>
+        <w:rPr>
+          <w:rFonts w:ascii="Arial" w:cs="Arial" w:eastAsia="Arial" w:hAnsi="Arial"/>
+          <w:b/>
+          <w:bCs/>
+          <w:sz w:val="28"/>
+          <w:szCs w:val="28"/>
+        </w:rPr>
+        <w:t xml:space="preserve">Part 4: Summary and Report Preparation</w:t>
+      </w:r>
+    </w:p>
+    <w:p>
+      <w:pPr>
+        <w:spacing w:after="120"/>
+      </w:pPr>
+      <w:r>
+        <w:rPr>
+          <w:rFonts w:ascii="Arial" w:cs="Arial" w:eastAsia="Arial" w:hAnsi="Arial"/>
+          <w:sz w:val="20"/>
+          <w:szCs w:val="20"/>
+        </w:rPr>
+        <w:t xml:space="preserve">Compile your results into a short report (2-3 pages) that includes the following elements:</w:t>
+      </w:r>
+    </w:p>
+    <w:p>
+      <w:pPr>
+        <w:pStyle w:val="ListParagraph"/>
+        <w:numPr>
+          <w:ilvl w:val="0"/>
+          <w:numId w:val="2"/>
+        </w:numPr>
+        <w:spacing w:after="80"/>
+      </w:pPr>
+      <w:r>
+        <w:rPr>
+          <w:rFonts w:ascii="Arial" w:cs="Arial" w:eastAsia="Arial" w:hAnsi="Arial"/>
+          <w:sz w:val="20"/>
+          <w:szCs w:val="20"/>
+        </w:rPr>
+        <w:t xml:space="preserve">A brief description of the molecule and the computational workflow you used.</w:t>
+      </w:r>
+    </w:p>
+    <w:p>
+      <w:pPr>
+        <w:pStyle w:val="ListParagraph"/>
+        <w:numPr>
+          <w:ilvl w:val="0"/>
+          <w:numId w:val="2"/>
+        </w:numPr>
+        <w:spacing w:after="80"/>
+      </w:pPr>
+      <w:r>
+        <w:rPr>
+          <w:rFonts w:ascii="Arial" w:cs="Arial" w:eastAsia="Arial" w:hAnsi="Arial"/>
+          <w:sz w:val="20"/>
+          <w:szCs w:val="20"/>
+        </w:rPr>
+        <w:t xml:space="preserve">Your functional benchmarking table (from Exercise 3.1) with a discussion of the trends you observed.</w:t>
+      </w:r>
+    </w:p>
+    <w:p>
+      <w:pPr>
+        <w:pStyle w:val="ListParagraph"/>
+        <w:numPr>
+          <w:ilvl w:val="0"/>
+          <w:numId w:val="2"/>
+        </w:numPr>
+        <w:spacing w:after="80"/>
+      </w:pPr>
+      <w:r>
+        <w:rPr>
+          <w:rFonts w:ascii="Arial" w:cs="Arial" w:eastAsia="Arial" w:hAnsi="Arial"/>
+          <w:sz w:val="20"/>
+          <w:szCs w:val="20"/>
+        </w:rPr>
+        <w:t xml:space="preserve">Your basis set convergence results (from Exercise 3.2).</w:t>
+      </w:r>
+    </w:p>
+    <w:p>
+      <w:pPr>
+        <w:pStyle w:val="ListParagraph"/>
+        <w:numPr>
+          <w:ilvl w:val="0"/>
+          <w:numId w:val="2"/>
+        </w:numPr>
+        <w:spacing w:after="80"/>
+      </w:pPr>
+      <w:r>
+        <w:rPr>
+          <w:rFonts w:ascii="Arial" w:cs="Arial" w:eastAsia="Arial" w:hAnsi="Arial"/>
+          <w:sz w:val="20"/>
+          <w:szCs w:val="20"/>
+        </w:rPr>
+        <w:t xml:space="preserve">At least one figure showing your computed UV-Vis spectrum overlaid with or compared to the experimental reference.</w:t>
+      </w:r>
+    </w:p>
+    <w:p>
+      <w:pPr>
+        <w:pStyle w:val="ListParagraph"/>
+        <w:numPr>
+          <w:ilvl w:val="0"/>
+          <w:numId w:val="2"/>
+        </w:numPr>
+        <w:spacing w:after="80"/>
+      </w:pPr>
+      <w:r>
+        <w:rPr>
+          <w:rFonts w:ascii="Arial" w:cs="Arial" w:eastAsia="Arial" w:hAnsi="Arial"/>
+          <w:sz w:val="20"/>
+          <w:szCs w:val="20"/>
+        </w:rPr>
+        <w:t xml:space="preserve">A justified recommendation for the best functional/basis set combination for this system, supported by your data and by reference to at least one benchmarking paper.</w:t>
+      </w:r>
+    </w:p>
+    <w:p>
+      <w:pPr>
+        <w:spacing w:after="120"/>
+      </w:pPr>
+    </w:p>
+    <w:p>
+      <w:pPr>
+        <w:pStyle w:val="Heading2"/>
+        <w:spacing w:before="280" w:after="120"/>
+      </w:pPr>
+      <w:r>
+        <w:rPr>
+          <w:rFonts w:ascii="Arial" w:cs="Arial" w:eastAsia="Arial" w:hAnsi="Arial"/>
+          <w:b/>
+          <w:bCs/>
+          <w:sz w:val="24"/>
+          <w:szCs w:val="24"/>
+        </w:rPr>
+        <w:t xml:space="preserve">Key References</w:t>
+      </w:r>
+    </w:p>
+    <w:p>
+      <w:pPr>
+        <w:pStyle w:val="ListParagraph"/>
+        <w:numPr>
+          <w:ilvl w:val="0"/>
+          <w:numId w:val="3"/>
+        </w:numPr>
+        <w:spacing w:after="60"/>
+      </w:pPr>
+      <w:r>
+        <w:rPr>
+          <w:rFonts w:ascii="Arial" w:cs="Arial" w:eastAsia="Arial" w:hAnsi="Arial"/>
+          <w:sz w:val="20"/>
+          <w:szCs w:val="20"/>
+        </w:rPr>
+        <w:t xml:space="preserve">Laurent, A. D.; Jacquemin, D. TD-DFT Benchmarks: A Review. Int. J. Quantum Chem. 2013, 113, 2019-2039.</w:t>
+      </w:r>
+    </w:p>
+    <w:p>
+      <w:pPr>
+        <w:pStyle w:val="ListParagraph"/>
+        <w:numPr>
+          <w:ilvl w:val="0"/>
+          <w:numId w:val="3"/>
+        </w:numPr>
+        <w:spacing w:after="60"/>
+      </w:pPr>
+      <w:r>
+        <w:rPr>
+          <w:rFonts w:ascii="Arial" w:cs="Arial" w:eastAsia="Arial" w:hAnsi="Arial"/>
+          <w:sz w:val="20"/>
+          <w:szCs w:val="20"/>
+        </w:rPr>
+        <w:t xml:space="preserve">Bursch, M.; Mewes, J.-M.; Hansen, A.; Grimme, S. Best-Practice DFT Protocols for Basic Molecular Computational Chemistry. Angew. Chem. Int. Ed. 2023, 62, e202205735.</w:t>
+      </w:r>
+    </w:p>
+    <w:p>
+      <w:pPr>
+        <w:pStyle w:val="ListParagraph"/>
+        <w:numPr>
+          <w:ilvl w:val="0"/>
+          <w:numId w:val="3"/>
+        </w:numPr>
+        <w:spacing w:after="60"/>
+      </w:pPr>
+      <w:r>
+        <w:rPr>
+          <w:rFonts w:ascii="Arial" w:cs="Arial" w:eastAsia="Arial" w:hAnsi="Arial"/>
+          <w:sz w:val="20"/>
+          <w:szCs w:val="20"/>
+        </w:rPr>
+        <w:t xml:space="preserve">Guido, C. A.; Jacquemin, D.; Adamo, C.; Mennucci, B. Electronic Excitations in Solution. J. Chem. Theory Comput. 2015, 11, 5782-5790.</w:t>
+      </w:r>
+    </w:p>
+    <w:p>
+      <w:pPr>
+        <w:spacing w:after="200"/>
+      </w:pPr>
+    </w:p>
+    <w:tbl>
+      <w:tblPr>
+        <w:tblW w:type="dxa" w:w="9360"/>
+        <w:tblBorders>
+          <w:top w:val="single" w:color="auto" w:sz="4"/>
+          <w:left w:val="single" w:color="auto" w:sz="4"/>
+          <w:bottom w:val="single" w:color="auto" w:sz="4"/>
+          <w:right w:val="single" w:color="auto" w:sz="4"/>
+          <w:insideH w:val="single" w:color="auto" w:sz="4"/>
+          <w:insideV w:val="single" w:color="auto" w:sz="4"/>
+        </w:tblBorders>
+      </w:tblPr>
+      <w:tblGrid>
+        <w:gridCol w:w="9360"/>
+      </w:tblGrid>
+      <w:tr>
+        <w:tc>
+          <w:tcPr>
+            <w:tcW w:type="dxa" w:w="9360"/>
+            <w:tcBorders>
+              <w:top w:val="single" w:color="AAAAAA" w:sz="1"/>
+              <w:left w:val="single" w:color="AAAAAA" w:sz="1"/>
+              <w:bottom w:val="single" w:color="AAAAAA" w:sz="1"/>
+              <w:right w:val="single" w:color="AAAAAA" w:sz="1"/>
+            </w:tcBorders>
+            <w:shd w:fill="FFF3CD" w:val="clear"/>
+            <w:tcMar>
+              <w:top w:type="dxa" w:w="80"/>
+              <w:left w:type="dxa" w:w="160"/>
+              <w:bottom w:type="dxa" w:w="80"/>
+              <w:right w:type="dxa" w:w="160"/>
+            </w:tcMar>
+          </w:tcPr>
+          <w:p>
+            <w:pPr>
+              <w:spacing w:after="60"/>
+            </w:pPr>
+            <w:r>
+              <w:rPr>
+                <w:rFonts w:ascii="Arial" w:cs="Arial" w:eastAsia="Arial" w:hAnsi="Arial"/>
+                <w:b/>
+                <w:bCs/>
+                <w:sz w:val="20"/>
+                <w:szCs w:val="20"/>
+              </w:rPr>
               <w:t xml:space="preserve">Script Quick Reference</w:t>
             </w:r>
           </w:p>
@@ -4616,7 +4925,7 @@
                 <w:sz w:val="19"/>
                 <w:szCs w:val="19"/>
               </w:rPr>
-              <w:t xml:space="preserve">Plot: python3 or_ecd_uvvis_tools.py pna/05_ecd/**/*.log --bw pna/04_boltzmann/pna_energies.dat --outdir pna --stick</w:t>
+              <w:t xml:space="preserve">Plot: python3 or_ecd_uvvis_tools.py pna/05_ecd/**/*.log --bw pna/04_boltzmann/pna_energies.dat --outdir pna --stick --flip_x</w:t>
             </w:r>
           </w:p>
         </w:tc>

</xml_diff>

<commit_message>
Update --soovent-model bug. Change Session 1 3.4
</commit_message>
<xml_diff>
--- a/Session1_UVVis_Benchmarking_Handout.docx
+++ b/Session1_UVVis_Benchmarking_Handout.docx
@@ -1674,7 +1674,7 @@
           <w:sz w:val="20"/>
           <w:szCs w:val="20"/>
         </w:rPr>
-        <w:t xml:space="preserve">The CPCM (Conductor-like Polarizable Continuum Model) surrounds the molecule with a dielectric continuum that mimics the electrostatic environment of bulk water. The optimized structures are written to pna/03_solvent_opt/pna_conf1/.</w:t>
+        <w:t xml:space="preserve">The workflow uses SMD (Solvation Model based on Density), which builds on the CPCM (Conductor-like Polarizable Continuum Model) dielectric cavity and adds short-range non-electrostatic terms. The optimized structures are written to pna/03_solvent_opt/pna_conf1/.</w:t>
       </w:r>
     </w:p>
     <w:tbl>
@@ -1761,7 +1761,7 @@
                 <w:sz w:val="19"/>
                 <w:szCs w:val="19"/>
               </w:rPr>
-              <w:t xml:space="preserve">For UV-Vis predictions, CPCM is often sufficient. SMD may improve accuracy for</w:t>
+              <w:t xml:space="preserve">This workflow uses SMD by default. Pure CPCM (electrostatics only) is available via</w:t>
             </w:r>
           </w:p>
           <w:p>
@@ -1774,7 +1774,7 @@
                 <w:sz w:val="19"/>
                 <w:szCs w:val="19"/>
               </w:rPr>
-              <w:t xml:space="preserve">strongly hydrogen-bonding solvents but adds computational cost.</w:t>
+              <w:t xml:space="preserve">--solvent-model cpcm. See Exercise 3.4 for a direct comparison.</w:t>
             </w:r>
           </w:p>
           <w:p>
@@ -2622,7 +2622,7 @@
           <w:sz w:val="20"/>
           <w:szCs w:val="20"/>
         </w:rPr>
-        <w:t xml:space="preserve">Re-run Stage 5 (and then re-plot) with each of the following functionals, keeping the basis set at def2-TZVP and the solvent as CPCM(WATER). To avoid overwriting your baseline results, create a separate working directory for each functional or rename the output directories between runs.</w:t>
+        <w:t xml:space="preserve">Re-run Stage 5 (and then re-plot) with each of the following functionals, keeping the basis set at def2-TZVP and the solvent model as SMD(WATER). To avoid overwriting your baseline results, create a separate working directory for each functional or rename the output directories between runs.</w:t>
       </w:r>
     </w:p>
     <w:p>
@@ -3897,7 +3897,7 @@
           <w:sz w:val="20"/>
           <w:szCs w:val="20"/>
         </w:rPr>
-        <w:t xml:space="preserve">Using your best-performing functional from Exercise 3.1, re-run the TDDFT calculation with different basis sets to evaluate basis set convergence. Keep all other parameters the same (CPCM/WATER, 20 roots).</w:t>
+        <w:t xml:space="preserve">Using your best-performing functional from Exercise 3.1, re-run the TDDFT calculation with different basis sets to evaluate basis set convergence. Keep all other parameters the same (SMD/WATER, 20 roots).</w:t>
       </w:r>
     </w:p>
     <w:p>
@@ -4268,7 +4268,7 @@
                 <w:sz w:val="20"/>
                 <w:szCs w:val="20"/>
               </w:rPr>
-              <w:t xml:space="preserve">PNA exhibits strong positive solvatochromism (the absorption band red-shifts in polar solvents). What is the physical origin of this effect? How well does the CPCM model capture it, and what limitations might an implicit solvent model have for this system?</w:t>
+              <w:t xml:space="preserve">PNA exhibits strong positive solvatochromism (the absorption band red-shifts in polar solvents). What is the physical origin of this effect? How well does the SMD model capture it, and what limitations might an implicit solvent model have for this system?</w:t>
             </w:r>
           </w:p>
         </w:tc>
@@ -4305,7 +4305,7 @@
           <w:sz w:val="20"/>
           <w:szCs w:val="20"/>
         </w:rPr>
-        <w:t xml:space="preserve">The earlier runs used CPCM for implicit solvation, which captures the bulk electrostatic response of the solvent. SMD adds short-range non-electrostatic terms (cavitation, dispersion, and solvent structure) that can improve accuracy in polar, hydrogen-bonding solvents. In this exercise you will repeat the B3LYP and CAM-B3LYP TDDFT calculations using SMD in place of CPCM and compare the effect on the predicted absorption maximum. Because SMD modifies both the geometry and the electronic structure, Stage 3 must be re-run before Stage 6.</w:t>
+        <w:t xml:space="preserve">Your Exercise 3.1 runs already used SMD by default, which adds short-range non-electrostatic terms (cavitation, dispersion, and solvent structure) on top of the CPCM dielectric cavity. In this exercise you will strip those terms away and re-run B3LYP and CAM-B3LYP with pure CPCM (electrostatics only) to isolate their contribution to the predicted absorption maximum. Because the solvent model affects both the geometry and the electronic structure, Stage 3 must be re-run before Stage 6.</w:t>
       </w:r>
     </w:p>
     <w:p>
@@ -4318,7 +4318,7 @@
           <w:sz w:val="20"/>
           <w:szCs w:val="20"/>
         </w:rPr>
-        <w:t xml:space="preserve">Re-run Stage 3 with SMD, then re-run Stage 4 (Boltzmann weighting), and finally re-run Stage 6 twice—once for B3LYP and once for CAM-B3LYP. Use the mv approach from Exercise 3.1 to preserve each result.</w:t>
+        <w:t xml:space="preserve">Re-run Stage 3 with pure CPCM, then re-run Stage 4 (Boltzmann weighting), and finally re-run Stage 6 twice—once for B3LYP and once for CAM-B3LYP. Use the mv approach from Exercise 3.1 to preserve each result.</w:t>
       </w:r>
     </w:p>
     <w:tbl>
@@ -4364,7 +4364,7 @@
                 <w:sz w:val="17"/>
                 <w:szCs w:val="17"/>
               </w:rPr>
-              <w:t xml:space="preserve"># Re-run Stage 3 with SMD</w:t>
+              <w:t xml:space="preserve"># Re-run Stage 3 with pure CPCM</w:t>
             </w:r>
           </w:p>
           <w:p>
@@ -4390,7 +4390,7 @@
                 <w:sz w:val="17"/>
                 <w:szCs w:val="17"/>
               </w:rPr>
-              <w:t xml:space="preserve">    --solvent water --solvent-model smd --cpus 4 molecules.txt</w:t>
+              <w:t xml:space="preserve">    --solvent water --solvent-model cpcm --cpus 4 molecules.txt</w:t>
             </w:r>
           </w:p>
           <w:p>
@@ -4429,7 +4429,7 @@
                 <w:sz w:val="17"/>
                 <w:szCs w:val="17"/>
               </w:rPr>
-              <w:t xml:space="preserve"># Run Stage 6 with B3LYP/SMD, then rename</w:t>
+              <w:t xml:space="preserve"># Run Stage 6 with B3LYP/CPCM, then rename</w:t>
             </w:r>
           </w:p>
           <w:p>
@@ -4455,33 +4455,33 @@
                 <w:sz w:val="17"/>
                 <w:szCs w:val="17"/>
               </w:rPr>
-              <w:t xml:space="preserve">    --solvent water --solvent-model smd --roots 20 --cpus 4 molecules.txt</w:t>
-            </w:r>
-          </w:p>
-          <w:p>
-            <w:pPr>
-              <w:spacing w:after="20"/>
-            </w:pPr>
-            <w:r>
-              <w:rPr>
-                <w:rFonts w:ascii="Courier New" w:cs="Courier New" w:eastAsia="Courier New" w:hAnsi="Courier New"/>
-                <w:sz w:val="17"/>
-                <w:szCs w:val="17"/>
-              </w:rPr>
-              <w:t xml:space="preserve">mv pna/05_ecd pna/05_ecd_b3lyp_smd</w:t>
-            </w:r>
-          </w:p>
-          <w:p>
-            <w:pPr>
-              <w:spacing w:after="20"/>
-            </w:pPr>
-            <w:r>
-              <w:rPr>
-                <w:rFonts w:ascii="Courier New" w:cs="Courier New" w:eastAsia="Courier New" w:hAnsi="Courier New"/>
-                <w:sz w:val="17"/>
-                <w:szCs w:val="17"/>
-              </w:rPr>
-              <w:t xml:space="preserve"># Run Stage 6 with CAM-B3LYP/SMD, then rename</w:t>
+              <w:t xml:space="preserve">    --solvent water --solvent-model cpcm --roots 20 --cpus 4 molecules.txt</w:t>
+            </w:r>
+          </w:p>
+          <w:p>
+            <w:pPr>
+              <w:spacing w:after="20"/>
+            </w:pPr>
+            <w:r>
+              <w:rPr>
+                <w:rFonts w:ascii="Courier New" w:cs="Courier New" w:eastAsia="Courier New" w:hAnsi="Courier New"/>
+                <w:sz w:val="17"/>
+                <w:szCs w:val="17"/>
+              </w:rPr>
+              <w:t xml:space="preserve">mv pna/05_ecd pna/05_ecd_b3lyp_cpcm</w:t>
+            </w:r>
+          </w:p>
+          <w:p>
+            <w:pPr>
+              <w:spacing w:after="20"/>
+            </w:pPr>
+            <w:r>
+              <w:rPr>
+                <w:rFonts w:ascii="Courier New" w:cs="Courier New" w:eastAsia="Courier New" w:hAnsi="Courier New"/>
+                <w:sz w:val="17"/>
+                <w:szCs w:val="17"/>
+              </w:rPr>
+              <w:t xml:space="preserve"># Run Stage 6 with CAM-B3LYP/CPCM, then rename</w:t>
             </w:r>
           </w:p>
           <w:p>
@@ -4507,20 +4507,20 @@
                 <w:sz w:val="17"/>
                 <w:szCs w:val="17"/>
               </w:rPr>
-              <w:t xml:space="preserve">    --solvent water --solvent-model smd --roots 20 --cpus 4 molecules.txt</w:t>
-            </w:r>
-          </w:p>
-          <w:p>
-            <w:pPr>
-              <w:spacing w:after="20"/>
-            </w:pPr>
-            <w:r>
-              <w:rPr>
-                <w:rFonts w:ascii="Courier New" w:cs="Courier New" w:eastAsia="Courier New" w:hAnsi="Courier New"/>
-                <w:sz w:val="17"/>
-                <w:szCs w:val="17"/>
-              </w:rPr>
-              <w:t xml:space="preserve">mv pna/05_ecd pna/05_ecd_camb3lyp_smd</w:t>
+              <w:t xml:space="preserve">    --solvent water --solvent-model cpcm --roots 20 --cpus 4 molecules.txt</w:t>
+            </w:r>
+          </w:p>
+          <w:p>
+            <w:pPr>
+              <w:spacing w:after="20"/>
+            </w:pPr>
+            <w:r>
+              <w:rPr>
+                <w:rFonts w:ascii="Courier New" w:cs="Courier New" w:eastAsia="Courier New" w:hAnsi="Courier New"/>
+                <w:sz w:val="17"/>
+                <w:szCs w:val="17"/>
+              </w:rPr>
+              <w:t xml:space="preserve">mv pna/05_ecd pna/05_ecd_camb3lyp_cpcm</w:t>
             </w:r>
           </w:p>
         </w:tc>
@@ -4536,7 +4536,7 @@
           <w:sz w:val="20"/>
           <w:szCs w:val="20"/>
         </w:rPr>
-        <w:t xml:space="preserve">Compare your SMD results with the CPCM results from Exercise 3.1 and record the shift in λmax for each functional.</w:t>
+        <w:t xml:space="preserve">Compare your CPCM results with the SMD results from Exercise 3.1 and record the shift in λmax for each functional.</w:t>
       </w:r>
     </w:p>
     <w:tbl>
@@ -4592,7 +4592,7 @@
                 <w:sz w:val="20"/>
                 <w:szCs w:val="20"/>
               </w:rPr>
-              <w:t xml:space="preserve">Does switching from CPCM to SMD produce a meaningful change in the predicted absorption maximum for B3LYP and CAM-B3LYP? Is the effect larger for the functional that underestimates the CT excitation energy (B3LYP) or for the one that performs better (CAM-B3LYP)? What physical differences between CPCM and SMD might explain your observations?</w:t>
+              <w:t xml:space="preserve">Does switching from SMD to pure CPCM produce a meaningful change in the predicted absorption maximum for B3LYP and CAM-B3LYP? Is the effect larger for the functional with the smaller error (B3LYP) or the larger error (CAM-B3LYP)? What physical terms does SMD include that CPCM omits, and how might those terms be particularly important for PNA in water?</w:t>
             </w:r>
           </w:p>
         </w:tc>

</xml_diff>